<commit_message>
make new folder & update kuble section03
</commit_message>
<xml_diff>
--- a/데브옵스를_위한_쿠버네티스_마스터_강의/section03.docx
+++ b/데브옵스를_위한_쿠버네티스_마스터_강의/section03.docx
@@ -6,19 +6,35 @@
       <w:pPr>
         <w:pStyle w:val="1"/>
       </w:pPr>
-      <w:r>
-        <w:rPr>
-          <w:rFonts w:hint="eastAsia"/>
-        </w:rPr>
-        <w:t>쿠버네티스 소개</w:t>
-      </w:r>
-    </w:p>
-    <w:p>
-      <w:r>
-        <w:rPr>
-          <w:rFonts w:hint="eastAsia"/>
-        </w:rPr>
-        <w:t>쿠버네티스 시작</w:t>
+      <w:proofErr w:type="spellStart"/>
+      <w:r>
+        <w:rPr>
+          <w:rFonts w:hint="eastAsia"/>
+        </w:rPr>
+        <w:t>쿠버네티스</w:t>
+      </w:r>
+      <w:proofErr w:type="spellEnd"/>
+      <w:r>
+        <w:rPr>
+          <w:rFonts w:hint="eastAsia"/>
+        </w:rPr>
+        <w:t xml:space="preserve"> 소개</w:t>
+      </w:r>
+    </w:p>
+    <w:p>
+      <w:proofErr w:type="spellStart"/>
+      <w:r>
+        <w:rPr>
+          <w:rFonts w:hint="eastAsia"/>
+        </w:rPr>
+        <w:t>쿠버네티스</w:t>
+      </w:r>
+      <w:proofErr w:type="spellEnd"/>
+      <w:r>
+        <w:rPr>
+          <w:rFonts w:hint="eastAsia"/>
+        </w:rPr>
+        <w:t xml:space="preserve"> 시작</w:t>
       </w:r>
     </w:p>
     <w:p>
@@ -146,20 +162,30 @@
       <w:r>
         <w:t>‘</w:t>
       </w:r>
+      <w:proofErr w:type="spellStart"/>
       <w:r>
         <w:rPr>
           <w:rFonts w:hint="eastAsia"/>
         </w:rPr>
         <w:t>쿠버네티스</w:t>
       </w:r>
+      <w:proofErr w:type="spellEnd"/>
       <w:r>
         <w:t>’</w:t>
       </w:r>
-      <w:r>
-        <w:rPr>
-          <w:rFonts w:hint="eastAsia"/>
-        </w:rPr>
-        <w:t>를 출시</w:t>
+      <w:proofErr w:type="spellStart"/>
+      <w:r>
+        <w:rPr>
+          <w:rFonts w:hint="eastAsia"/>
+        </w:rPr>
+        <w:t>를</w:t>
+      </w:r>
+      <w:proofErr w:type="spellEnd"/>
+      <w:r>
+        <w:rPr>
+          <w:rFonts w:hint="eastAsia"/>
+        </w:rPr>
+        <w:t xml:space="preserve"> 출시</w:t>
       </w:r>
     </w:p>
     <w:p/>
@@ -167,11 +193,19 @@
       <w:pPr>
         <w:pStyle w:val="2"/>
       </w:pPr>
-      <w:r>
-        <w:rPr>
-          <w:rFonts w:hint="eastAsia"/>
-        </w:rPr>
-        <w:t>쿠버네티스의 장점</w:t>
+      <w:proofErr w:type="spellStart"/>
+      <w:r>
+        <w:rPr>
+          <w:rFonts w:hint="eastAsia"/>
+        </w:rPr>
+        <w:t>쿠버네티스의</w:t>
+      </w:r>
+      <w:proofErr w:type="spellEnd"/>
+      <w:r>
+        <w:rPr>
+          <w:rFonts w:hint="eastAsia"/>
+        </w:rPr>
+        <w:t xml:space="preserve"> 장점</w:t>
       </w:r>
     </w:p>
     <w:p>
@@ -487,11 +521,19 @@
         </w:numPr>
         <w:ind w:leftChars="0"/>
       </w:pPr>
-      <w:r>
-        <w:rPr>
-          <w:rFonts w:hint="eastAsia"/>
-        </w:rPr>
-        <w:t>쿠버네티스에 의존해 서비스 제공</w:t>
+      <w:proofErr w:type="spellStart"/>
+      <w:r>
+        <w:rPr>
+          <w:rFonts w:hint="eastAsia"/>
+        </w:rPr>
+        <w:t>쿠버네티스에</w:t>
+      </w:r>
+      <w:proofErr w:type="spellEnd"/>
+      <w:r>
+        <w:rPr>
+          <w:rFonts w:hint="eastAsia"/>
+        </w:rPr>
+        <w:t xml:space="preserve"> 의존해 서비스 제공</w:t>
       </w:r>
     </w:p>
     <w:p>
@@ -525,7 +567,21 @@
         <w:rPr>
           <w:rFonts w:hint="eastAsia"/>
         </w:rPr>
-        <w:t>로드 밸런싱,</w:t>
+        <w:t xml:space="preserve">로드 </w:t>
+      </w:r>
+      <w:proofErr w:type="spellStart"/>
+      <w:r>
+        <w:rPr>
+          <w:rFonts w:hint="eastAsia"/>
+        </w:rPr>
+        <w:t>밸런싱</w:t>
+      </w:r>
+      <w:proofErr w:type="spellEnd"/>
+      <w:r>
+        <w:rPr>
+          <w:rFonts w:hint="eastAsia"/>
+        </w:rPr>
+        <w:t>,</w:t>
       </w:r>
       <w:r>
         <w:t xml:space="preserve"> </w:t>
@@ -672,11 +728,19 @@
       <w:pPr>
         <w:pStyle w:val="2"/>
       </w:pPr>
-      <w:r>
-        <w:rPr>
-          <w:rFonts w:hint="eastAsia"/>
-        </w:rPr>
-        <w:t>쿠버네티스 클러스터 아키텍처</w:t>
+      <w:proofErr w:type="spellStart"/>
+      <w:r>
+        <w:rPr>
+          <w:rFonts w:hint="eastAsia"/>
+        </w:rPr>
+        <w:t>쿠버네티스</w:t>
+      </w:r>
+      <w:proofErr w:type="spellEnd"/>
+      <w:r>
+        <w:rPr>
+          <w:rFonts w:hint="eastAsia"/>
+        </w:rPr>
+        <w:t xml:space="preserve"> 클러스터 아키텍처</w:t>
       </w:r>
     </w:p>
     <w:p>
@@ -688,11 +752,19 @@
         </w:numPr>
         <w:ind w:leftChars="0"/>
       </w:pPr>
-      <w:r>
-        <w:rPr>
-          <w:rFonts w:hint="eastAsia"/>
-        </w:rPr>
-        <w:t>쿠버네티스의 클러스터는 하드웨어 수준에서 많은 노드로 구성되며 두 가지 유형으로 나뉨</w:t>
+      <w:proofErr w:type="spellStart"/>
+      <w:r>
+        <w:rPr>
+          <w:rFonts w:hint="eastAsia"/>
+        </w:rPr>
+        <w:t>쿠버네티스의</w:t>
+      </w:r>
+      <w:proofErr w:type="spellEnd"/>
+      <w:r>
+        <w:rPr>
+          <w:rFonts w:hint="eastAsia"/>
+        </w:rPr>
+        <w:t xml:space="preserve"> 클러스터는 하드웨어 수준에서 많은 노드로 구성되며 두 가지 유형으로 나뉨</w:t>
       </w:r>
     </w:p>
     <w:p>
@@ -717,7 +789,49 @@
         <w:rPr>
           <w:rFonts w:hint="eastAsia"/>
         </w:rPr>
-        <w:t>전체 쿠버네티스 시스템을 관리하고 통제하는 쿠버네티스 컨트롤 플레인을 관장</w:t>
+        <w:t xml:space="preserve">전체 </w:t>
+      </w:r>
+      <w:proofErr w:type="spellStart"/>
+      <w:r>
+        <w:rPr>
+          <w:rFonts w:hint="eastAsia"/>
+        </w:rPr>
+        <w:t>쿠버네티스</w:t>
+      </w:r>
+      <w:proofErr w:type="spellEnd"/>
+      <w:r>
+        <w:rPr>
+          <w:rFonts w:hint="eastAsia"/>
+        </w:rPr>
+        <w:t xml:space="preserve"> 시스템을 관리하고 통제하는 </w:t>
+      </w:r>
+      <w:proofErr w:type="spellStart"/>
+      <w:r>
+        <w:rPr>
+          <w:rFonts w:hint="eastAsia"/>
+        </w:rPr>
+        <w:t>쿠버네티스</w:t>
+      </w:r>
+      <w:proofErr w:type="spellEnd"/>
+      <w:r>
+        <w:rPr>
+          <w:rFonts w:hint="eastAsia"/>
+        </w:rPr>
+        <w:t xml:space="preserve"> 컨트롤 </w:t>
+      </w:r>
+      <w:proofErr w:type="spellStart"/>
+      <w:r>
+        <w:rPr>
+          <w:rFonts w:hint="eastAsia"/>
+        </w:rPr>
+        <w:t>플레인을</w:t>
+      </w:r>
+      <w:proofErr w:type="spellEnd"/>
+      <w:r>
+        <w:rPr>
+          <w:rFonts w:hint="eastAsia"/>
+        </w:rPr>
+        <w:t xml:space="preserve"> 관장</w:t>
       </w:r>
     </w:p>
     <w:p>
@@ -791,12 +905,20 @@
       <w:pPr>
         <w:pStyle w:val="2"/>
       </w:pPr>
+      <w:proofErr w:type="spellStart"/>
       <w:r>
         <w:rPr>
           <w:rFonts w:hint="eastAsia"/>
         </w:rPr>
         <w:lastRenderedPageBreak/>
-        <w:t>쿠버네티스에서 애플리케이션 실행</w:t>
+        <w:t>쿠버네티스에서</w:t>
+      </w:r>
+      <w:proofErr w:type="spellEnd"/>
+      <w:r>
+        <w:rPr>
+          <w:rFonts w:hint="eastAsia"/>
+        </w:rPr>
+        <w:t xml:space="preserve"> 애플리케이션 실행</w:t>
       </w:r>
     </w:p>
     <w:p>
@@ -864,10 +986,37 @@
         <w:rPr>
           <w:rFonts w:hint="eastAsia"/>
         </w:rPr>
-        <w:t>앱 디스크립터(</w:t>
-      </w:r>
-      <w:r>
-        <w:t xml:space="preserve">json, yaml) </w:t>
+        <w:t xml:space="preserve">앱 </w:t>
+      </w:r>
+      <w:proofErr w:type="spellStart"/>
+      <w:r>
+        <w:rPr>
+          <w:rFonts w:hint="eastAsia"/>
+        </w:rPr>
+        <w:t>디스크립터</w:t>
+      </w:r>
+      <w:proofErr w:type="spellEnd"/>
+      <w:r>
+        <w:rPr>
+          <w:rFonts w:hint="eastAsia"/>
+        </w:rPr>
+        <w:t>(</w:t>
+      </w:r>
+      <w:proofErr w:type="spellStart"/>
+      <w:r>
+        <w:t>json</w:t>
+      </w:r>
+      <w:proofErr w:type="spellEnd"/>
+      <w:r>
+        <w:t xml:space="preserve">, </w:t>
+      </w:r>
+      <w:proofErr w:type="spellStart"/>
+      <w:r>
+        <w:t>yaml</w:t>
+      </w:r>
+      <w:proofErr w:type="spellEnd"/>
+      <w:r>
+        <w:t xml:space="preserve">) </w:t>
       </w:r>
       <w:r>
         <w:rPr>
@@ -893,9 +1042,11 @@
         </w:rPr>
         <w:t xml:space="preserve">역할 중인 </w:t>
       </w:r>
+      <w:proofErr w:type="spellStart"/>
       <w:r>
         <w:t>kublet</w:t>
       </w:r>
+      <w:proofErr w:type="spellEnd"/>
       <w:r>
         <w:rPr>
           <w:rFonts w:hint="eastAsia"/>
@@ -903,8 +1054,13 @@
         <w:t xml:space="preserve">에게 명령 </w:t>
       </w:r>
       <w:r>
-        <w:t>-&gt; containerd</w:t>
-      </w:r>
+        <w:t xml:space="preserve">-&gt; </w:t>
+      </w:r>
+      <w:proofErr w:type="spellStart"/>
+      <w:r>
+        <w:t>containerd</w:t>
+      </w:r>
+      <w:proofErr w:type="spellEnd"/>
       <w:r>
         <w:rPr>
           <w:rFonts w:hint="eastAsia"/>
@@ -938,7 +1094,21 @@
         <w:rPr>
           <w:rFonts w:hint="eastAsia"/>
         </w:rPr>
-        <w:t>구글 쿠버네티스 엔진)</w:t>
+        <w:t xml:space="preserve">구글 </w:t>
+      </w:r>
+      <w:proofErr w:type="spellStart"/>
+      <w:r>
+        <w:rPr>
+          <w:rFonts w:hint="eastAsia"/>
+        </w:rPr>
+        <w:t>쿠버네티스</w:t>
+      </w:r>
+      <w:proofErr w:type="spellEnd"/>
+      <w:r>
+        <w:rPr>
+          <w:rFonts w:hint="eastAsia"/>
+        </w:rPr>
+        <w:t xml:space="preserve"> 엔진)</w:t>
       </w:r>
     </w:p>
     <w:p>
@@ -986,15 +1156,37 @@
         <w:rPr>
           <w:rFonts w:hint="eastAsia"/>
         </w:rPr>
-        <w:t>장점은 클라우드 네이티브를 어느 정도 바로 사용할 수 있도록 세팅되어 있다는 점</w:t>
-      </w:r>
-    </w:p>
-    <w:p>
-      <w:r>
-        <w:rPr>
-          <w:rFonts w:hint="eastAsia"/>
-        </w:rPr>
-        <w:t>온프레미스(우분투)</w:t>
+        <w:t xml:space="preserve">장점은 클라우드 네이티브를 어느 정도 바로 사용할 수 있도록 </w:t>
+      </w:r>
+      <w:proofErr w:type="spellStart"/>
+      <w:r>
+        <w:rPr>
+          <w:rFonts w:hint="eastAsia"/>
+        </w:rPr>
+        <w:t>세팅되어</w:t>
+      </w:r>
+      <w:proofErr w:type="spellEnd"/>
+      <w:r>
+        <w:rPr>
+          <w:rFonts w:hint="eastAsia"/>
+        </w:rPr>
+        <w:t xml:space="preserve"> 있다는 점</w:t>
+      </w:r>
+    </w:p>
+    <w:p>
+      <w:proofErr w:type="spellStart"/>
+      <w:r>
+        <w:rPr>
+          <w:rFonts w:hint="eastAsia"/>
+        </w:rPr>
+        <w:t>온프레미스</w:t>
+      </w:r>
+      <w:proofErr w:type="spellEnd"/>
+      <w:r>
+        <w:rPr>
+          <w:rFonts w:hint="eastAsia"/>
+        </w:rPr>
+        <w:t>(우분투)</w:t>
       </w:r>
     </w:p>
     <w:p>
@@ -1026,7 +1218,21 @@
         <w:rPr>
           <w:rFonts w:hint="eastAsia"/>
         </w:rPr>
-        <w:t>장점은 쿠버네티스 클러스터의 모든 설정을 직접 조작할 수 있으므로 서비스를 구성하는 다양한 기능 테스트 가능</w:t>
+        <w:t xml:space="preserve">장점은 </w:t>
+      </w:r>
+      <w:proofErr w:type="spellStart"/>
+      <w:r>
+        <w:rPr>
+          <w:rFonts w:hint="eastAsia"/>
+        </w:rPr>
+        <w:t>쿠버네티스</w:t>
+      </w:r>
+      <w:proofErr w:type="spellEnd"/>
+      <w:r>
+        <w:rPr>
+          <w:rFonts w:hint="eastAsia"/>
+        </w:rPr>
+        <w:t xml:space="preserve"> 클러스터의 모든 설정을 직접 조작할 수 있으므로 서비스를 구성하는 다양한 기능 테스트 가능</w:t>
       </w:r>
     </w:p>
     <w:p>
@@ -1064,7 +1270,21 @@
           <w:rFonts w:hint="eastAsia"/>
         </w:rPr>
         <w:lastRenderedPageBreak/>
-        <w:t>구글 쿠버네티스 엔진 소개와 회원가입 안내</w:t>
+        <w:t xml:space="preserve">구글 </w:t>
+      </w:r>
+      <w:proofErr w:type="spellStart"/>
+      <w:r>
+        <w:rPr>
+          <w:rFonts w:hint="eastAsia"/>
+        </w:rPr>
+        <w:t>쿠버네티스</w:t>
+      </w:r>
+      <w:proofErr w:type="spellEnd"/>
+      <w:r>
+        <w:rPr>
+          <w:rFonts w:hint="eastAsia"/>
+        </w:rPr>
+        <w:t xml:space="preserve"> 엔진 소개와 회원가입 안내</w:t>
       </w:r>
     </w:p>
     <w:p>
@@ -1234,11 +1454,19 @@
         </w:numPr>
         <w:ind w:leftChars="0"/>
       </w:pPr>
-      <w:r>
-        <w:rPr>
-          <w:rFonts w:hint="eastAsia"/>
-        </w:rPr>
-        <w:t>온프레미스 및 클라우드 간의 자유로운 이동이 가능하다.</w:t>
+      <w:proofErr w:type="spellStart"/>
+      <w:r>
+        <w:rPr>
+          <w:rFonts w:hint="eastAsia"/>
+        </w:rPr>
+        <w:t>온프레미스</w:t>
+      </w:r>
+      <w:proofErr w:type="spellEnd"/>
+      <w:r>
+        <w:rPr>
+          <w:rFonts w:hint="eastAsia"/>
+        </w:rPr>
+        <w:t xml:space="preserve"> 및 클라우드 간의 자유로운 이동이 가능하다.</w:t>
       </w:r>
     </w:p>
     <w:p>
@@ -1294,7 +1522,21 @@
         <w:rPr>
           <w:rFonts w:hint="eastAsia"/>
         </w:rPr>
-        <w:t>만약 회원가입이 되어 있어 크레딧이 없는 경우에는 구글 계정을 새로 만들어 사용하거나,</w:t>
+        <w:t xml:space="preserve">만약 회원가입이 되어 있어 </w:t>
+      </w:r>
+      <w:proofErr w:type="spellStart"/>
+      <w:r>
+        <w:rPr>
+          <w:rFonts w:hint="eastAsia"/>
+        </w:rPr>
+        <w:t>크레딧이</w:t>
+      </w:r>
+      <w:proofErr w:type="spellEnd"/>
+      <w:r>
+        <w:rPr>
+          <w:rFonts w:hint="eastAsia"/>
+        </w:rPr>
+        <w:t xml:space="preserve"> 없는 경우에는 구글 계정을 새로 만들어 사용하거나,</w:t>
       </w:r>
       <w:r>
         <w:t xml:space="preserve"> </w:t>
@@ -1435,8 +1677,13 @@
         </w:rPr>
         <w:t xml:space="preserve">상단 </w:t>
       </w:r>
-      <w:r>
-        <w:t xml:space="preserve">GoogleCloud </w:t>
+      <w:proofErr w:type="spellStart"/>
+      <w:r>
+        <w:t>GoogleCloud</w:t>
+      </w:r>
+      <w:proofErr w:type="spellEnd"/>
+      <w:r>
+        <w:t xml:space="preserve"> </w:t>
       </w:r>
       <w:r>
         <w:rPr>
@@ -2039,7 +2286,21 @@
         <w:rPr>
           <w:rFonts w:hint="eastAsia"/>
         </w:rPr>
-        <w:t>가상 머신을 생성해준다.</w:t>
+        <w:t xml:space="preserve">가상 </w:t>
+      </w:r>
+      <w:proofErr w:type="spellStart"/>
+      <w:r>
+        <w:rPr>
+          <w:rFonts w:hint="eastAsia"/>
+        </w:rPr>
+        <w:t>머신을</w:t>
+      </w:r>
+      <w:proofErr w:type="spellEnd"/>
+      <w:r>
+        <w:rPr>
+          <w:rFonts w:hint="eastAsia"/>
+        </w:rPr>
+        <w:t xml:space="preserve"> 생성해준다.</w:t>
       </w:r>
       <w:r>
         <w:t xml:space="preserve"> </w:t>
@@ -2218,11 +2479,19 @@
       <w:r>
         <w:t xml:space="preserve">- </w:t>
       </w:r>
-      <w:r>
-        <w:rPr>
-          <w:rFonts w:hint="eastAsia"/>
-        </w:rPr>
-        <w:t>리전 안에 있는 논리적으로 분리된 물리적 데이터 센터 클러스터</w:t>
+      <w:proofErr w:type="spellStart"/>
+      <w:r>
+        <w:rPr>
+          <w:rFonts w:hint="eastAsia"/>
+        </w:rPr>
+        <w:t>리전</w:t>
+      </w:r>
+      <w:proofErr w:type="spellEnd"/>
+      <w:r>
+        <w:rPr>
+          <w:rFonts w:hint="eastAsia"/>
+        </w:rPr>
+        <w:t xml:space="preserve"> 안에 있는 논리적으로 분리된 물리적 데이터 센터 클러스터</w:t>
       </w:r>
     </w:p>
     <w:p>
@@ -2234,11 +2503,19 @@
         </w:numPr>
         <w:ind w:leftChars="0"/>
       </w:pPr>
-      <w:r>
-        <w:rPr>
-          <w:rFonts w:hint="eastAsia"/>
-        </w:rPr>
-        <w:t xml:space="preserve">리전 </w:t>
+      <w:proofErr w:type="spellStart"/>
+      <w:r>
+        <w:rPr>
+          <w:rFonts w:hint="eastAsia"/>
+        </w:rPr>
+        <w:t>리전</w:t>
+      </w:r>
+      <w:proofErr w:type="spellEnd"/>
+      <w:r>
+        <w:rPr>
+          <w:rFonts w:hint="eastAsia"/>
+        </w:rPr>
+        <w:t xml:space="preserve"> </w:t>
       </w:r>
       <w:r>
         <w:t xml:space="preserve">- </w:t>
@@ -2576,7 +2853,35 @@
         <w:rPr>
           <w:rFonts w:hint="eastAsia"/>
         </w:rPr>
-        <w:t>컨테이너의 메뉴 중 연결을 누르면 다음과 같이 명령줄 엑섹스를 확인할 수 있다.</w:t>
+        <w:t xml:space="preserve">컨테이너의 메뉴 중 연결을 누르면 다음과 같이 </w:t>
+      </w:r>
+      <w:proofErr w:type="spellStart"/>
+      <w:r>
+        <w:rPr>
+          <w:rFonts w:hint="eastAsia"/>
+        </w:rPr>
+        <w:t>명령줄</w:t>
+      </w:r>
+      <w:proofErr w:type="spellEnd"/>
+      <w:r>
+        <w:rPr>
+          <w:rFonts w:hint="eastAsia"/>
+        </w:rPr>
+        <w:t xml:space="preserve"> </w:t>
+      </w:r>
+      <w:proofErr w:type="spellStart"/>
+      <w:r>
+        <w:rPr>
+          <w:rFonts w:hint="eastAsia"/>
+        </w:rPr>
+        <w:t>엑섹스를</w:t>
+      </w:r>
+      <w:proofErr w:type="spellEnd"/>
+      <w:r>
+        <w:rPr>
+          <w:rFonts w:hint="eastAsia"/>
+        </w:rPr>
+        <w:t xml:space="preserve"> 확인할 수 있다.</w:t>
       </w:r>
       <w:r>
         <w:t xml:space="preserve"> </w:t>
@@ -2727,6 +3032,7 @@
       </w:r>
     </w:p>
     <w:p>
+      <w:proofErr w:type="spellStart"/>
       <w:r>
         <w:rPr>
           <w:rFonts w:hint="eastAsia"/>
@@ -2735,7 +3041,11 @@
         <w:t>k</w:t>
       </w:r>
       <w:r>
-        <w:t xml:space="preserve">ubectl get nodes: </w:t>
+        <w:t>ubectl</w:t>
+      </w:r>
+      <w:proofErr w:type="spellEnd"/>
+      <w:r>
+        <w:t xml:space="preserve"> get nodes: </w:t>
       </w:r>
       <w:r>
         <w:rPr>
@@ -2804,8 +3114,29 @@
       </w:r>
     </w:p>
     <w:p>
-      <w:r>
-        <w:t>kubectl create deploy tc --image=consol/tomcat-</w:t>
+      <w:proofErr w:type="spellStart"/>
+      <w:r>
+        <w:t>kubectl</w:t>
+      </w:r>
+      <w:proofErr w:type="spellEnd"/>
+      <w:r>
+        <w:t xml:space="preserve"> create deploy </w:t>
+      </w:r>
+      <w:proofErr w:type="spellStart"/>
+      <w:r>
+        <w:t>tc</w:t>
+      </w:r>
+      <w:proofErr w:type="spellEnd"/>
+      <w:r>
+        <w:t xml:space="preserve"> --image=</w:t>
+      </w:r>
+      <w:proofErr w:type="spellStart"/>
+      <w:r>
+        <w:t>consol</w:t>
+      </w:r>
+      <w:proofErr w:type="spellEnd"/>
+      <w:r>
+        <w:t>/tomcat-</w:t>
       </w:r>
       <w:r>
         <w:t>9</w:t>
@@ -2848,6 +3179,7 @@
         </w:numPr>
         <w:ind w:leftChars="0"/>
       </w:pPr>
+      <w:proofErr w:type="spellStart"/>
       <w:r>
         <w:rPr>
           <w:rFonts w:hint="eastAsia"/>
@@ -2855,7 +3187,11 @@
         <w:t>t</w:t>
       </w:r>
       <w:r>
-        <w:t xml:space="preserve">c: </w:t>
+        <w:t>c</w:t>
+      </w:r>
+      <w:proofErr w:type="spellEnd"/>
+      <w:r>
+        <w:t xml:space="preserve">: </w:t>
       </w:r>
       <w:r>
         <w:rPr>
@@ -2924,8 +3260,29 @@
       </w:r>
     </w:p>
     <w:p>
-      <w:r>
-        <w:t>kubectl expose deploy tc --type=LoadBalancer --port=80 --target-port=8080</w:t>
+      <w:proofErr w:type="spellStart"/>
+      <w:r>
+        <w:t>kubectl</w:t>
+      </w:r>
+      <w:proofErr w:type="spellEnd"/>
+      <w:r>
+        <w:t xml:space="preserve"> expose deploy </w:t>
+      </w:r>
+      <w:proofErr w:type="spellStart"/>
+      <w:r>
+        <w:t>tc</w:t>
+      </w:r>
+      <w:proofErr w:type="spellEnd"/>
+      <w:r>
+        <w:t xml:space="preserve"> --type=</w:t>
+      </w:r>
+      <w:proofErr w:type="spellStart"/>
+      <w:r>
+        <w:t>LoadBalancer</w:t>
+      </w:r>
+      <w:proofErr w:type="spellEnd"/>
+      <w:r>
+        <w:t xml:space="preserve"> --port=80 --target-port=8080</w:t>
       </w:r>
     </w:p>
     <w:p>
@@ -2940,11 +3297,19 @@
       <w:r>
         <w:t xml:space="preserve">expose: </w:t>
       </w:r>
-      <w:r>
-        <w:rPr>
-          <w:rFonts w:hint="eastAsia"/>
-        </w:rPr>
-        <w:t>포트포워딩을 통해 외부에 서비스를 노출하는 명령어</w:t>
+      <w:proofErr w:type="spellStart"/>
+      <w:r>
+        <w:rPr>
+          <w:rFonts w:hint="eastAsia"/>
+        </w:rPr>
+        <w:t>포트포워딩을</w:t>
+      </w:r>
+      <w:proofErr w:type="spellEnd"/>
+      <w:r>
+        <w:rPr>
+          <w:rFonts w:hint="eastAsia"/>
+        </w:rPr>
+        <w:t xml:space="preserve"> 통해 외부에 서비스를 노출하는 명령어</w:t>
       </w:r>
     </w:p>
     <w:p>
@@ -2972,7 +3337,15 @@
         <w:t>t</w:t>
       </w:r>
       <w:r>
-        <w:t xml:space="preserve">ype-LoadBalancer: </w:t>
+        <w:t>ype-</w:t>
+      </w:r>
+      <w:proofErr w:type="spellStart"/>
+      <w:r>
+        <w:t>LoadBalancer</w:t>
+      </w:r>
+      <w:proofErr w:type="spellEnd"/>
+      <w:r>
+        <w:t xml:space="preserve">: </w:t>
       </w:r>
       <w:r>
         <w:rPr>
@@ -3024,9 +3397,19 @@
       </w:r>
     </w:p>
     <w:p>
-      <w:r>
-        <w:t>kubectl get pods,svc</w:t>
-      </w:r>
+      <w:proofErr w:type="spellStart"/>
+      <w:r>
+        <w:t>kubectl</w:t>
+      </w:r>
+      <w:proofErr w:type="spellEnd"/>
+      <w:r>
+        <w:t xml:space="preserve"> get </w:t>
+      </w:r>
+      <w:proofErr w:type="spellStart"/>
+      <w:r>
+        <w:t>pods,svc</w:t>
+      </w:r>
+      <w:proofErr w:type="spellEnd"/>
     </w:p>
     <w:p>
       <w:pPr>
@@ -3172,8 +3555,13 @@
         <w:t>개가 배포된 것과,</w:t>
       </w:r>
       <w:r>
-        <w:t xml:space="preserve"> service/tc</w:t>
-      </w:r>
+        <w:t xml:space="preserve"> service/</w:t>
+      </w:r>
+      <w:proofErr w:type="spellStart"/>
+      <w:r>
+        <w:t>tc</w:t>
+      </w:r>
+      <w:proofErr w:type="spellEnd"/>
       <w:r>
         <w:rPr>
           <w:rFonts w:hint="eastAsia"/>
@@ -3253,8 +3641,13 @@
         </w:rPr>
         <w:t xml:space="preserve">하지만 </w:t>
       </w:r>
-      <w:r>
-        <w:t>ImagePullBackOff(</w:t>
+      <w:proofErr w:type="spellStart"/>
+      <w:r>
+        <w:t>ImagePullBackOff</w:t>
+      </w:r>
+      <w:proofErr w:type="spellEnd"/>
+      <w:r>
+        <w:t>(</w:t>
       </w:r>
       <w:r>
         <w:rPr>
@@ -3286,12 +3679,55 @@
         <w:rPr>
           <w:rFonts w:hint="eastAsia"/>
         </w:rPr>
-        <w:t>이를 해결하기 위해 공식 이미지를 사용하도록 디플로이먼트의 이미지를 변경하였다.</w:t>
-      </w:r>
-    </w:p>
-    <w:p>
-      <w:r>
-        <w:t>kubectl get deploy tc -o jsonpath='{.spec.template.spec.containers[*].name}{"\n"}'</w:t>
+        <w:t xml:space="preserve">이를 해결하기 위해 공식 이미지를 사용하도록 </w:t>
+      </w:r>
+      <w:proofErr w:type="spellStart"/>
+      <w:r>
+        <w:rPr>
+          <w:rFonts w:hint="eastAsia"/>
+        </w:rPr>
+        <w:t>디플로이먼트의</w:t>
+      </w:r>
+      <w:proofErr w:type="spellEnd"/>
+      <w:r>
+        <w:rPr>
+          <w:rFonts w:hint="eastAsia"/>
+        </w:rPr>
+        <w:t xml:space="preserve"> 이미지를 변경하였다.</w:t>
+      </w:r>
+    </w:p>
+    <w:p>
+      <w:proofErr w:type="spellStart"/>
+      <w:r>
+        <w:t>kubectl</w:t>
+      </w:r>
+      <w:proofErr w:type="spellEnd"/>
+      <w:r>
+        <w:t xml:space="preserve"> get deploy </w:t>
+      </w:r>
+      <w:proofErr w:type="spellStart"/>
+      <w:r>
+        <w:t>tc</w:t>
+      </w:r>
+      <w:proofErr w:type="spellEnd"/>
+      <w:r>
+        <w:t xml:space="preserve"> -o </w:t>
+      </w:r>
+      <w:proofErr w:type="spellStart"/>
+      <w:r>
+        <w:t>jsonpath</w:t>
+      </w:r>
+      <w:proofErr w:type="spellEnd"/>
+      <w:r>
+        <w:t>='{.</w:t>
+      </w:r>
+      <w:proofErr w:type="spellStart"/>
+      <w:r>
+        <w:t>spec.template.spec.containers</w:t>
+      </w:r>
+      <w:proofErr w:type="spellEnd"/>
+      <w:r>
+        <w:t>[*].name}{"\n"}'</w:t>
       </w:r>
       <w:r>
         <w:rPr>
@@ -3343,18 +3779,46 @@
       </w:r>
     </w:p>
     <w:p>
-      <w:r>
-        <w:t>kubectl set image deploy/tc tomcat-7-0-jnnr9=tomcat:7.0</w:t>
-      </w:r>
-    </w:p>
-    <w:p>
-      <w:r>
-        <w:t>kubectl rollout status deploy/tc</w:t>
-      </w:r>
-    </w:p>
-    <w:p>
-      <w:r>
-        <w:t>kubectl get pods -o wide</w:t>
+      <w:proofErr w:type="spellStart"/>
+      <w:r>
+        <w:t>kubectl</w:t>
+      </w:r>
+      <w:proofErr w:type="spellEnd"/>
+      <w:r>
+        <w:t xml:space="preserve"> set image deploy/</w:t>
+      </w:r>
+      <w:proofErr w:type="spellStart"/>
+      <w:r>
+        <w:t>tc</w:t>
+      </w:r>
+      <w:proofErr w:type="spellEnd"/>
+      <w:r>
+        <w:t xml:space="preserve"> tomcat-7-0-jnnr9=tomcat:7.0</w:t>
+      </w:r>
+    </w:p>
+    <w:p>
+      <w:proofErr w:type="spellStart"/>
+      <w:r>
+        <w:t>kubectl</w:t>
+      </w:r>
+      <w:proofErr w:type="spellEnd"/>
+      <w:r>
+        <w:t xml:space="preserve"> rollout status deploy/</w:t>
+      </w:r>
+      <w:proofErr w:type="spellStart"/>
+      <w:r>
+        <w:t>tc</w:t>
+      </w:r>
+      <w:proofErr w:type="spellEnd"/>
+    </w:p>
+    <w:p>
+      <w:proofErr w:type="spellStart"/>
+      <w:r>
+        <w:t>kubectl</w:t>
+      </w:r>
+      <w:proofErr w:type="spellEnd"/>
+      <w:r>
+        <w:t xml:space="preserve"> get pods -o wide</w:t>
       </w:r>
     </w:p>
     <w:p>
@@ -3413,12 +3877,39 @@
         <w:rPr>
           <w:rFonts w:hint="eastAsia"/>
         </w:rPr>
-        <w:t>가 제대로 작동하는 것을 확인 후 혹시 모르니 다음 명령어를 통해 엔드포인트가 생성된 것도 확인한다.</w:t>
-      </w:r>
-    </w:p>
-    <w:p>
-      <w:r>
-        <w:t>kubectl get endpoints tc -o wide</w:t>
+        <w:t xml:space="preserve">가 제대로 작동하는 것을 확인 후 혹시 모르니 다음 명령어를 통해 </w:t>
+      </w:r>
+      <w:proofErr w:type="spellStart"/>
+      <w:r>
+        <w:rPr>
+          <w:rFonts w:hint="eastAsia"/>
+        </w:rPr>
+        <w:t>엔드포인트가</w:t>
+      </w:r>
+      <w:proofErr w:type="spellEnd"/>
+      <w:r>
+        <w:rPr>
+          <w:rFonts w:hint="eastAsia"/>
+        </w:rPr>
+        <w:t xml:space="preserve"> 생성된 것도 확인한다.</w:t>
+      </w:r>
+    </w:p>
+    <w:p>
+      <w:proofErr w:type="spellStart"/>
+      <w:r>
+        <w:t>kubectl</w:t>
+      </w:r>
+      <w:proofErr w:type="spellEnd"/>
+      <w:r>
+        <w:t xml:space="preserve"> get endpoints </w:t>
+      </w:r>
+      <w:proofErr w:type="spellStart"/>
+      <w:r>
+        <w:t>tc</w:t>
+      </w:r>
+      <w:proofErr w:type="spellEnd"/>
+      <w:r>
+        <w:t xml:space="preserve"> -o wide</w:t>
       </w:r>
     </w:p>
     <w:p>
@@ -3471,8 +3962,13 @@
         <w:lastRenderedPageBreak/>
         <w:t xml:space="preserve">이후 다시 </w:t>
       </w:r>
-      <w:r>
-        <w:t xml:space="preserve">kubectl get pod, svc </w:t>
+      <w:proofErr w:type="spellStart"/>
+      <w:r>
+        <w:t>kubectl</w:t>
+      </w:r>
+      <w:proofErr w:type="spellEnd"/>
+      <w:r>
+        <w:t xml:space="preserve"> get pod, svc </w:t>
       </w:r>
       <w:r>
         <w:rPr>
@@ -3546,7 +4042,21 @@
         <w:rPr>
           <w:rFonts w:hint="eastAsia"/>
         </w:rPr>
-        <w:t>에러(트래픽은 톰캣까지 도달했지만,</w:t>
+        <w:t xml:space="preserve">에러(트래픽은 </w:t>
+      </w:r>
+      <w:proofErr w:type="spellStart"/>
+      <w:r>
+        <w:rPr>
+          <w:rFonts w:hint="eastAsia"/>
+        </w:rPr>
+        <w:t>톰캣까지</w:t>
+      </w:r>
+      <w:proofErr w:type="spellEnd"/>
+      <w:r>
+        <w:rPr>
+          <w:rFonts w:hint="eastAsia"/>
+        </w:rPr>
+        <w:t xml:space="preserve"> 도달했지만,</w:t>
       </w:r>
       <w:r>
         <w:t xml:space="preserve"> </w:t>
@@ -3564,7 +4074,21 @@
         <w:rPr>
           <w:rFonts w:hint="eastAsia"/>
         </w:rPr>
-        <w:t>에 올라간 웹앱이 없는 상태)가 발생할</w:t>
+        <w:t xml:space="preserve">에 올라간 </w:t>
+      </w:r>
+      <w:proofErr w:type="spellStart"/>
+      <w:r>
+        <w:rPr>
+          <w:rFonts w:hint="eastAsia"/>
+        </w:rPr>
+        <w:t>웹앱이</w:t>
+      </w:r>
+      <w:proofErr w:type="spellEnd"/>
+      <w:r>
+        <w:rPr>
+          <w:rFonts w:hint="eastAsia"/>
+        </w:rPr>
+        <w:t xml:space="preserve"> 없는 상태)가 발생할</w:t>
       </w:r>
       <w:r>
         <w:t xml:space="preserve"> </w:t>
@@ -3582,17 +4106,76 @@
         <w:rPr>
           <w:rFonts w:hint="eastAsia"/>
         </w:rPr>
-        <w:t>이를 위해 기본 앱을 복사해서 띄워둔 후 접속해보자.</w:t>
-      </w:r>
-    </w:p>
-    <w:p>
-      <w:r>
-        <w:t>kubectl patch deploy tc --type='json' -p='[</w:t>
-      </w:r>
-    </w:p>
-    <w:p>
-      <w:r>
-        <w:t xml:space="preserve">  {"op":"add","path":"/spec/template/spec/containers/0/command","value":["/bin/sh","-c","cp -r /usr/local/tomcat/webapps.dist/* /usr/local/tomcat/webapps/; exec catalina.sh run"]}</w:t>
+        <w:t xml:space="preserve">이를 위해 기본 앱을 복사해서 </w:t>
+      </w:r>
+      <w:proofErr w:type="spellStart"/>
+      <w:r>
+        <w:rPr>
+          <w:rFonts w:hint="eastAsia"/>
+        </w:rPr>
+        <w:t>띄워둔</w:t>
+      </w:r>
+      <w:proofErr w:type="spellEnd"/>
+      <w:r>
+        <w:rPr>
+          <w:rFonts w:hint="eastAsia"/>
+        </w:rPr>
+        <w:t xml:space="preserve"> 후 접속해보자.</w:t>
+      </w:r>
+    </w:p>
+    <w:p>
+      <w:proofErr w:type="spellStart"/>
+      <w:r>
+        <w:t>kubectl</w:t>
+      </w:r>
+      <w:proofErr w:type="spellEnd"/>
+      <w:r>
+        <w:t xml:space="preserve"> patch deploy </w:t>
+      </w:r>
+      <w:proofErr w:type="spellStart"/>
+      <w:r>
+        <w:t>tc</w:t>
+      </w:r>
+      <w:proofErr w:type="spellEnd"/>
+      <w:r>
+        <w:t xml:space="preserve"> --type='</w:t>
+      </w:r>
+      <w:proofErr w:type="spellStart"/>
+      <w:r>
+        <w:t>json</w:t>
+      </w:r>
+      <w:proofErr w:type="spellEnd"/>
+      <w:r>
+        <w:t>' -p='[</w:t>
+      </w:r>
+    </w:p>
+    <w:p>
+      <w:r>
+        <w:t xml:space="preserve">  {"op":"add","path":"/spec/template/spec/containers/0/command","value":["/bin/sh","-c","cp -r /</w:t>
+      </w:r>
+      <w:proofErr w:type="spellStart"/>
+      <w:r>
+        <w:t>usr</w:t>
+      </w:r>
+      <w:proofErr w:type="spellEnd"/>
+      <w:r>
+        <w:t>/local/tomcat/</w:t>
+      </w:r>
+      <w:proofErr w:type="spellStart"/>
+      <w:r>
+        <w:t>webapps.dist</w:t>
+      </w:r>
+      <w:proofErr w:type="spellEnd"/>
+      <w:r>
+        <w:t>/* /</w:t>
+      </w:r>
+      <w:proofErr w:type="spellStart"/>
+      <w:r>
+        <w:t>usr</w:t>
+      </w:r>
+      <w:proofErr w:type="spellEnd"/>
+      <w:r>
+        <w:t>/local/tomcat/webapps/; exec catalina.sh run"]}</w:t>
       </w:r>
     </w:p>
     <w:p>
@@ -3601,9 +4184,19 @@
       </w:r>
     </w:p>
     <w:p>
-      <w:r>
-        <w:t>kubectl rollout status deploy/tc</w:t>
-      </w:r>
+      <w:proofErr w:type="spellStart"/>
+      <w:r>
+        <w:t>kubectl</w:t>
+      </w:r>
+      <w:proofErr w:type="spellEnd"/>
+      <w:r>
+        <w:t xml:space="preserve"> rollout status deploy/</w:t>
+      </w:r>
+      <w:proofErr w:type="spellStart"/>
+      <w:r>
+        <w:t>tc</w:t>
+      </w:r>
+      <w:proofErr w:type="spellEnd"/>
     </w:p>
     <w:p>
       <w:r>
@@ -3710,9 +4303,19 @@
       </w:r>
     </w:p>
     <w:p>
-      <w:r>
-        <w:t>kubectl delete all --all</w:t>
-      </w:r>
+      <w:proofErr w:type="spellStart"/>
+      <w:r>
+        <w:t>kubectl</w:t>
+      </w:r>
+      <w:proofErr w:type="spellEnd"/>
+      <w:r>
+        <w:t xml:space="preserve"> delete all --</w:t>
+      </w:r>
+      <w:proofErr w:type="spellStart"/>
+      <w:r>
+        <w:t>all</w:t>
+      </w:r>
+      <w:proofErr w:type="spellEnd"/>
     </w:p>
     <w:p>
       <w:r>
@@ -3838,7 +4441,21 @@
         <w:rPr>
           <w:rFonts w:hint="eastAsia"/>
         </w:rPr>
-        <w:t xml:space="preserve">이는 새로고침을 하면 </w:t>
+        <w:t xml:space="preserve">이는 </w:t>
+      </w:r>
+      <w:proofErr w:type="spellStart"/>
+      <w:r>
+        <w:rPr>
+          <w:rFonts w:hint="eastAsia"/>
+        </w:rPr>
+        <w:t>새로고침을</w:t>
+      </w:r>
+      <w:proofErr w:type="spellEnd"/>
+      <w:r>
+        <w:rPr>
+          <w:rFonts w:hint="eastAsia"/>
+        </w:rPr>
+        <w:t xml:space="preserve"> 하면 </w:t>
       </w:r>
       <w:r>
         <w:t>5</w:t>
@@ -3847,7 +4464,21 @@
         <w:rPr>
           <w:rFonts w:hint="eastAsia"/>
         </w:rPr>
-        <w:t>개 중 랜덤으로 바뀌어 로드밸런싱이 이뤄지고 있다는 것을 볼 수 있다.</w:t>
+        <w:t xml:space="preserve">개 중 랜덤으로 바뀌어 </w:t>
+      </w:r>
+      <w:proofErr w:type="spellStart"/>
+      <w:r>
+        <w:rPr>
+          <w:rFonts w:hint="eastAsia"/>
+        </w:rPr>
+        <w:t>로드밸런싱이</w:t>
+      </w:r>
+      <w:proofErr w:type="spellEnd"/>
+      <w:r>
+        <w:rPr>
+          <w:rFonts w:hint="eastAsia"/>
+        </w:rPr>
+        <w:t xml:space="preserve"> 이뤄지고 있다는 것을 볼 수 있다.</w:t>
       </w:r>
       <w:r>
         <w:t>1</w:t>
@@ -4128,8 +4759,13 @@
       </w:r>
       <w:r>
         <w:br/>
-        <w:t>Manager GUI( /manager/html ) → manager-gui</w:t>
-      </w:r>
+        <w:t>Manager GUI( /manager/html ) → manager-</w:t>
+      </w:r>
+      <w:proofErr w:type="spellStart"/>
+      <w:r>
+        <w:t>gui</w:t>
+      </w:r>
+      <w:proofErr w:type="spellEnd"/>
     </w:p>
     <w:p>
       <w:pPr>
@@ -4141,7 +4777,23 @@
         <w:ind w:leftChars="0"/>
       </w:pPr>
       <w:r>
-        <w:t xml:space="preserve">(보안 밸브) manager/host-manager의 context.xml에 있는 RemoteAddrValve가 로컬호스트만 허용하도록 막고 있어서 외부에서 403 </w:t>
+        <w:t xml:space="preserve">(보안 밸브) manager/host-manager의 context.xml에 있는 </w:t>
+      </w:r>
+      <w:proofErr w:type="spellStart"/>
+      <w:r>
+        <w:t>RemoteAddrValve</w:t>
+      </w:r>
+      <w:proofErr w:type="spellEnd"/>
+      <w:r>
+        <w:t xml:space="preserve">가 </w:t>
+      </w:r>
+      <w:proofErr w:type="spellStart"/>
+      <w:r>
+        <w:t>로컬호스트만</w:t>
+      </w:r>
+      <w:proofErr w:type="spellEnd"/>
+      <w:r>
+        <w:t xml:space="preserve"> 허용하도록 막고 있어서 외부에서 403 </w:t>
       </w:r>
       <w:r>
         <w:rPr>
@@ -4175,7 +4827,15 @@
     </w:p>
     <w:p>
       <w:r>
-        <w:t># 1) manager 기본 앱도 보이게 webapps.dist 복사</w:t>
+        <w:t xml:space="preserve"># 1) manager 기본 앱도 보이게 </w:t>
+      </w:r>
+      <w:proofErr w:type="spellStart"/>
+      <w:r>
+        <w:t>webapps.dist</w:t>
+      </w:r>
+      <w:proofErr w:type="spellEnd"/>
+      <w:r>
+        <w:t xml:space="preserve"> 복사</w:t>
       </w:r>
     </w:p>
     <w:p>
@@ -4185,12 +4845,41 @@
     </w:p>
     <w:p>
       <w:r>
-        <w:t># 3) manager/host-manager의 RemoteAddrValve 제거(또는 허용대역으로 수정)</w:t>
-      </w:r>
-    </w:p>
-    <w:p>
-      <w:r>
-        <w:t>kubectl patch deploy tc --type='json' -p='[</w:t>
+        <w:t xml:space="preserve"># 3) manager/host-manager의 </w:t>
+      </w:r>
+      <w:proofErr w:type="spellStart"/>
+      <w:r>
+        <w:t>RemoteAddrValve</w:t>
+      </w:r>
+      <w:proofErr w:type="spellEnd"/>
+      <w:r>
+        <w:t xml:space="preserve"> 제거(또는 허용대역으로 수정)</w:t>
+      </w:r>
+    </w:p>
+    <w:p>
+      <w:proofErr w:type="spellStart"/>
+      <w:r>
+        <w:t>kubectl</w:t>
+      </w:r>
+      <w:proofErr w:type="spellEnd"/>
+      <w:r>
+        <w:t xml:space="preserve"> patch deploy </w:t>
+      </w:r>
+      <w:proofErr w:type="spellStart"/>
+      <w:r>
+        <w:t>tc</w:t>
+      </w:r>
+      <w:proofErr w:type="spellEnd"/>
+      <w:r>
+        <w:t xml:space="preserve"> --type='</w:t>
+      </w:r>
+      <w:proofErr w:type="spellStart"/>
+      <w:r>
+        <w:t>json</w:t>
+      </w:r>
+      <w:proofErr w:type="spellEnd"/>
+      <w:r>
+        <w:t>' -p='[</w:t>
       </w:r>
     </w:p>
     <w:p>
@@ -4205,17 +4894,105 @@
     </w:p>
     <w:p>
       <w:r>
-        <w:t xml:space="preserve">     cp -r /usr/local/tomcat/webapps.dist/* /usr/local/tomcat/webapps/; \</w:t>
-      </w:r>
-    </w:p>
-    <w:p>
-      <w:r>
-        <w:t xml:space="preserve">     if ! grep -q manager-status /usr/local/tomcat/conf/tomcat-users.xml; then \</w:t>
-      </w:r>
-    </w:p>
-    <w:p>
-      <w:r>
-        <w:t xml:space="preserve">       sed -i \"s#&lt;/tomcat-users&gt;#&lt;role rolename=\\\"manager-gui\\\"/&gt;\\n&lt;role rolename=\\\"manager-status\\\"/&gt;\\n&lt;user username=\\\"admin\\\" password=\\\"adminpass\\\" roles=\\\"manager-gui,manager-status\\\"/&gt;\\n&lt;/tomcat-users&gt;#\" /usr/local/tomcat/conf/tomcat-users.xml; \</w:t>
+        <w:t xml:space="preserve">     cp -r /</w:t>
+      </w:r>
+      <w:proofErr w:type="spellStart"/>
+      <w:r>
+        <w:t>usr</w:t>
+      </w:r>
+      <w:proofErr w:type="spellEnd"/>
+      <w:r>
+        <w:t>/local/tomcat/</w:t>
+      </w:r>
+      <w:proofErr w:type="spellStart"/>
+      <w:r>
+        <w:t>webapps.dist</w:t>
+      </w:r>
+      <w:proofErr w:type="spellEnd"/>
+      <w:r>
+        <w:t>/* /</w:t>
+      </w:r>
+      <w:proofErr w:type="spellStart"/>
+      <w:r>
+        <w:t>usr</w:t>
+      </w:r>
+      <w:proofErr w:type="spellEnd"/>
+      <w:r>
+        <w:t>/local/tomcat/webapps/; \</w:t>
+      </w:r>
+    </w:p>
+    <w:p>
+      <w:r>
+        <w:t xml:space="preserve">     if ! grep -q manager-status /</w:t>
+      </w:r>
+      <w:proofErr w:type="spellStart"/>
+      <w:r>
+        <w:t>usr</w:t>
+      </w:r>
+      <w:proofErr w:type="spellEnd"/>
+      <w:r>
+        <w:t>/local/tomcat/conf/tomcat-users.xml; then \</w:t>
+      </w:r>
+    </w:p>
+    <w:p>
+      <w:r>
+        <w:t xml:space="preserve">       sed -</w:t>
+      </w:r>
+      <w:proofErr w:type="spellStart"/>
+      <w:r>
+        <w:t>i</w:t>
+      </w:r>
+      <w:proofErr w:type="spellEnd"/>
+      <w:r>
+        <w:t xml:space="preserve"> \"s#&lt;/tomcat-users&gt;#&lt;role </w:t>
+      </w:r>
+      <w:proofErr w:type="spellStart"/>
+      <w:r>
+        <w:t>rolename</w:t>
+      </w:r>
+      <w:proofErr w:type="spellEnd"/>
+      <w:r>
+        <w:t>=\\\"manager-</w:t>
+      </w:r>
+      <w:proofErr w:type="spellStart"/>
+      <w:r>
+        <w:t>gui</w:t>
+      </w:r>
+      <w:proofErr w:type="spellEnd"/>
+      <w:r>
+        <w:t xml:space="preserve">\\\"/&gt;\\n&lt;role </w:t>
+      </w:r>
+      <w:proofErr w:type="spellStart"/>
+      <w:r>
+        <w:t>rolename</w:t>
+      </w:r>
+      <w:proofErr w:type="spellEnd"/>
+      <w:r>
+        <w:t>=\\\"manager-status\\\"/&gt;\\n&lt;user username=\\\"admin\\\" password=\\\"</w:t>
+      </w:r>
+      <w:proofErr w:type="spellStart"/>
+      <w:r>
+        <w:t>adminpass</w:t>
+      </w:r>
+      <w:proofErr w:type="spellEnd"/>
+      <w:r>
+        <w:t>\\\" roles=\\\"manager-</w:t>
+      </w:r>
+      <w:proofErr w:type="spellStart"/>
+      <w:r>
+        <w:t>gui,manager</w:t>
+      </w:r>
+      <w:proofErr w:type="spellEnd"/>
+      <w:r>
+        <w:t>-status\\\"/&gt;\\n&lt;/tomcat-users&gt;#\" /</w:t>
+      </w:r>
+      <w:proofErr w:type="spellStart"/>
+      <w:r>
+        <w:t>usr</w:t>
+      </w:r>
+      <w:proofErr w:type="spellEnd"/>
+      <w:r>
+        <w:t>/local/tomcat/conf/tomcat-users.xml; \</w:t>
       </w:r>
     </w:p>
     <w:p>
@@ -4225,12 +5002,60 @@
     </w:p>
     <w:p>
       <w:r>
-        <w:t xml:space="preserve">     sed -i \"/RemoteAddrValve/d\" /usr/local/tomcat/webapps/manager/META-INF/context.xml || true; \</w:t>
-      </w:r>
-    </w:p>
-    <w:p>
-      <w:r>
-        <w:t xml:space="preserve">     sed -i \"/RemoteAddrValve/d\" /usr/local/tomcat/webapps/host-manager/META-INF/context.xml || true; \</w:t>
+        <w:t xml:space="preserve">     sed -</w:t>
+      </w:r>
+      <w:proofErr w:type="spellStart"/>
+      <w:r>
+        <w:t>i</w:t>
+      </w:r>
+      <w:proofErr w:type="spellEnd"/>
+      <w:r>
+        <w:t xml:space="preserve"> \"/</w:t>
+      </w:r>
+      <w:proofErr w:type="spellStart"/>
+      <w:r>
+        <w:t>RemoteAddrValve</w:t>
+      </w:r>
+      <w:proofErr w:type="spellEnd"/>
+      <w:r>
+        <w:t>/d\" /</w:t>
+      </w:r>
+      <w:proofErr w:type="spellStart"/>
+      <w:r>
+        <w:t>usr</w:t>
+      </w:r>
+      <w:proofErr w:type="spellEnd"/>
+      <w:r>
+        <w:t>/local/tomcat/webapps/manager/META-INF/context.xml || true; \</w:t>
+      </w:r>
+    </w:p>
+    <w:p>
+      <w:r>
+        <w:t xml:space="preserve">     sed -</w:t>
+      </w:r>
+      <w:proofErr w:type="spellStart"/>
+      <w:r>
+        <w:t>i</w:t>
+      </w:r>
+      <w:proofErr w:type="spellEnd"/>
+      <w:r>
+        <w:t xml:space="preserve"> \"/</w:t>
+      </w:r>
+      <w:proofErr w:type="spellStart"/>
+      <w:r>
+        <w:t>RemoteAddrValve</w:t>
+      </w:r>
+      <w:proofErr w:type="spellEnd"/>
+      <w:r>
+        <w:t>/d\" /</w:t>
+      </w:r>
+      <w:proofErr w:type="spellStart"/>
+      <w:r>
+        <w:t>usr</w:t>
+      </w:r>
+      <w:proofErr w:type="spellEnd"/>
+      <w:r>
+        <w:t>/local/tomcat/webapps/host-manager/META-INF/context.xml || true; \</w:t>
       </w:r>
     </w:p>
     <w:p>
@@ -4249,9 +5074,19 @@
       </w:r>
     </w:p>
     <w:p>
-      <w:r>
-        <w:t>kubectl rollout status deploy/tc</w:t>
-      </w:r>
+      <w:proofErr w:type="spellStart"/>
+      <w:r>
+        <w:t>kubectl</w:t>
+      </w:r>
+      <w:proofErr w:type="spellEnd"/>
+      <w:r>
+        <w:t xml:space="preserve"> rollout status deploy/</w:t>
+      </w:r>
+      <w:proofErr w:type="spellStart"/>
+      <w:r>
+        <w:t>tc</w:t>
+      </w:r>
+      <w:proofErr w:type="spellEnd"/>
     </w:p>
     <w:p>
       <w:r>
@@ -4261,7 +5096,15 @@
         <w:t xml:space="preserve">이후 다시 접속한 후 인증창에 </w:t>
       </w:r>
       <w:r>
-        <w:t xml:space="preserve">admin / adminpass </w:t>
+        <w:t xml:space="preserve">admin / </w:t>
+      </w:r>
+      <w:proofErr w:type="spellStart"/>
+      <w:r>
+        <w:t>adminpass</w:t>
+      </w:r>
+      <w:proofErr w:type="spellEnd"/>
+      <w:r>
+        <w:t xml:space="preserve"> </w:t>
       </w:r>
       <w:r>
         <w:rPr>
@@ -4315,8 +5158,21 @@
         </w:numPr>
         <w:ind w:leftChars="0"/>
       </w:pPr>
-      <w:r>
-        <w:t>RemoteAddrValve를 다시 넣고 본인 고정 IP만 허용(정규식 allow 수정)</w:t>
+      <w:proofErr w:type="spellStart"/>
+      <w:r>
+        <w:t>RemoteAddrValve</w:t>
+      </w:r>
+      <w:proofErr w:type="spellEnd"/>
+      <w:r>
+        <w:t>를 다시 넣고 본인 고정 IP만 허용(</w:t>
+      </w:r>
+      <w:proofErr w:type="spellStart"/>
+      <w:r>
+        <w:t>정규식</w:t>
+      </w:r>
+      <w:proofErr w:type="spellEnd"/>
+      <w:r>
+        <w:t xml:space="preserve"> allow 수정)</w:t>
       </w:r>
     </w:p>
     <w:p>
@@ -4348,7 +5204,15 @@
         <w:t>외부</w:t>
       </w:r>
       <w:r>
-        <w:t xml:space="preserve"> 노출 금지(내부 서비스로 전환) 후, kubectl port-forward로만 접근</w:t>
+        <w:t xml:space="preserve"> 노출 금지(내부 서비스로 전환) 후, </w:t>
+      </w:r>
+      <w:proofErr w:type="spellStart"/>
+      <w:r>
+        <w:t>kubectl</w:t>
+      </w:r>
+      <w:proofErr w:type="spellEnd"/>
+      <w:r>
+        <w:t xml:space="preserve"> port-forward로만 접근</w:t>
       </w:r>
     </w:p>
     <w:p>
@@ -4379,6 +5243,7 @@
       </w:r>
     </w:p>
     <w:p>
+      <w:proofErr w:type="spellStart"/>
       <w:r>
         <w:rPr>
           <w:rFonts w:hint="eastAsia"/>
@@ -4386,7 +5251,19 @@
         <w:t>k</w:t>
       </w:r>
       <w:r>
-        <w:t xml:space="preserve">ubectl get pods -owide </w:t>
+        <w:t>ubectl</w:t>
+      </w:r>
+      <w:proofErr w:type="spellEnd"/>
+      <w:r>
+        <w:t xml:space="preserve"> get pods -</w:t>
+      </w:r>
+      <w:proofErr w:type="spellStart"/>
+      <w:r>
+        <w:t>owide</w:t>
+      </w:r>
+      <w:proofErr w:type="spellEnd"/>
+      <w:r>
+        <w:t xml:space="preserve"> </w:t>
       </w:r>
       <w:r>
         <w:rPr>
@@ -4529,11 +5406,19 @@
       <w:pPr>
         <w:pStyle w:val="2"/>
       </w:pPr>
-      <w:r>
-        <w:rPr>
-          <w:rFonts w:hint="eastAsia"/>
-        </w:rPr>
-        <w:t>쿠버네티스 설치 필요 사항</w:t>
+      <w:proofErr w:type="spellStart"/>
+      <w:r>
+        <w:rPr>
+          <w:rFonts w:hint="eastAsia"/>
+        </w:rPr>
+        <w:t>쿠버네티스</w:t>
+      </w:r>
+      <w:proofErr w:type="spellEnd"/>
+      <w:r>
+        <w:rPr>
+          <w:rFonts w:hint="eastAsia"/>
+        </w:rPr>
+        <w:t xml:space="preserve"> 설치 필요 사항</w:t>
       </w:r>
     </w:p>
     <w:p>
@@ -4591,11 +5476,33 @@
       <w:r>
         <w:t xml:space="preserve">: </w:t>
       </w:r>
-      <w:r>
-        <w:rPr>
-          <w:rFonts w:hint="eastAsia"/>
-        </w:rPr>
-        <w:t>쿠퍼네티스의 마스터노드가 설정될 호스트</w:t>
+      <w:proofErr w:type="spellStart"/>
+      <w:r>
+        <w:rPr>
+          <w:rFonts w:hint="eastAsia"/>
+        </w:rPr>
+        <w:t>쿠퍼네티스의</w:t>
+      </w:r>
+      <w:proofErr w:type="spellEnd"/>
+      <w:r>
+        <w:rPr>
+          <w:rFonts w:hint="eastAsia"/>
+        </w:rPr>
+        <w:t xml:space="preserve"> </w:t>
+      </w:r>
+      <w:proofErr w:type="spellStart"/>
+      <w:r>
+        <w:rPr>
+          <w:rFonts w:hint="eastAsia"/>
+        </w:rPr>
+        <w:t>마스터노드가</w:t>
+      </w:r>
+      <w:proofErr w:type="spellEnd"/>
+      <w:r>
+        <w:rPr>
+          <w:rFonts w:hint="eastAsia"/>
+        </w:rPr>
+        <w:t xml:space="preserve"> 설정될 호스트</w:t>
       </w:r>
     </w:p>
     <w:p>
@@ -4654,7 +5561,21 @@
         <w:rPr>
           <w:rFonts w:hint="eastAsia"/>
         </w:rPr>
-        <w:t xml:space="preserve">가상 머신은 </w:t>
+        <w:t xml:space="preserve">가상 </w:t>
+      </w:r>
+      <w:proofErr w:type="spellStart"/>
+      <w:r>
+        <w:rPr>
+          <w:rFonts w:hint="eastAsia"/>
+        </w:rPr>
+        <w:t>머신은</w:t>
+      </w:r>
+      <w:proofErr w:type="spellEnd"/>
+      <w:r>
+        <w:rPr>
+          <w:rFonts w:hint="eastAsia"/>
+        </w:rPr>
+        <w:t xml:space="preserve"> </w:t>
       </w:r>
       <w:r>
         <w:t>2</w:t>
@@ -4676,12 +5597,10 @@
       </w:r>
     </w:p>
     <w:p>
-      <w:pPr>
-        <w:rPr>
-          <w:rFonts w:hint="eastAsia"/>
-        </w:rPr>
-      </w:pPr>
-      <w:r>
+      <w:r>
+        <w:rPr>
+          <w:noProof/>
+        </w:rPr>
         <w:lastRenderedPageBreak/>
         <w:drawing>
           <wp:inline distT="0" distB="0" distL="0" distR="0" wp14:anchorId="4F4ECD81" wp14:editId="5BA2EFDE">
@@ -4741,8 +5660,45 @@
         <w:ind w:leftChars="0"/>
       </w:pPr>
       <w:r>
-        <w:t>호환되는 리눅스 머신. 쿠버네티스 프로젝트는 데비안 기반 배포판, 레드햇 기반 배포판</w:t>
-      </w:r>
+        <w:t xml:space="preserve">호환되는 리눅스 머신. </w:t>
+      </w:r>
+      <w:proofErr w:type="spellStart"/>
+      <w:r>
+        <w:t>쿠버네티스</w:t>
+      </w:r>
+      <w:proofErr w:type="spellEnd"/>
+      <w:r>
+        <w:t xml:space="preserve"> 프로젝트는 </w:t>
+      </w:r>
+      <w:proofErr w:type="spellStart"/>
+      <w:r>
+        <w:t>데비안</w:t>
+      </w:r>
+      <w:proofErr w:type="spellEnd"/>
+      <w:r>
+        <w:t xml:space="preserve"> 기반 </w:t>
+      </w:r>
+      <w:proofErr w:type="spellStart"/>
+      <w:r>
+        <w:t>배포판</w:t>
+      </w:r>
+      <w:proofErr w:type="spellEnd"/>
+      <w:r>
+        <w:t xml:space="preserve">, </w:t>
+      </w:r>
+      <w:proofErr w:type="spellStart"/>
+      <w:r>
+        <w:t>레드햇</w:t>
+      </w:r>
+      <w:proofErr w:type="spellEnd"/>
+      <w:r>
+        <w:t xml:space="preserve"> 기반 </w:t>
+      </w:r>
+      <w:proofErr w:type="spellStart"/>
+      <w:r>
+        <w:t>배포판</w:t>
+      </w:r>
+      <w:proofErr w:type="spellEnd"/>
       <w:r>
         <w:rPr>
           <w:rFonts w:hint="eastAsia"/>
@@ -4987,7 +5943,21 @@
         <w:rPr>
           <w:rFonts w:hint="eastAsia"/>
         </w:rPr>
-        <w:t>클러스터의 모든 머신에 걸친 전체 네트워크 연결</w:t>
+        <w:t xml:space="preserve">클러스터의 모든 </w:t>
+      </w:r>
+      <w:proofErr w:type="spellStart"/>
+      <w:r>
+        <w:rPr>
+          <w:rFonts w:hint="eastAsia"/>
+        </w:rPr>
+        <w:t>머신에</w:t>
+      </w:r>
+      <w:proofErr w:type="spellEnd"/>
+      <w:r>
+        <w:rPr>
+          <w:rFonts w:hint="eastAsia"/>
+        </w:rPr>
+        <w:t xml:space="preserve"> 걸친 전체 네트워크 연결</w:t>
       </w:r>
       <w:r>
         <w:t>. (</w:t>
@@ -5023,8 +5993,13 @@
         </w:rPr>
         <w:t xml:space="preserve">주소 및 </w:t>
       </w:r>
-      <w:r>
-        <w:t xml:space="preserve">product_uuid. </w:t>
+      <w:proofErr w:type="spellStart"/>
+      <w:r>
+        <w:t>product_uuid</w:t>
+      </w:r>
+      <w:proofErr w:type="spellEnd"/>
+      <w:r>
+        <w:t xml:space="preserve">. </w:t>
       </w:r>
       <w:r>
         <w:rPr>
@@ -5095,20 +6070,47 @@
         </w:numPr>
         <w:ind w:leftChars="0"/>
       </w:pPr>
-      <w:r>
-        <w:rPr>
-          <w:rFonts w:hint="eastAsia"/>
-        </w:rPr>
-        <w:t>스왑의 비활성화.</w:t>
-      </w:r>
-      <w:r>
-        <w:t xml:space="preserve"> kubelet</w:t>
-      </w:r>
-      <w:r>
-        <w:rPr>
-          <w:rFonts w:hint="eastAsia"/>
-        </w:rPr>
-        <w:t>이 제대로 작동하게 하려면 반드시 스왑을 사용하지 않도록 설정한다.</w:t>
+      <w:proofErr w:type="spellStart"/>
+      <w:r>
+        <w:rPr>
+          <w:rFonts w:hint="eastAsia"/>
+        </w:rPr>
+        <w:t>스왑의</w:t>
+      </w:r>
+      <w:proofErr w:type="spellEnd"/>
+      <w:r>
+        <w:rPr>
+          <w:rFonts w:hint="eastAsia"/>
+        </w:rPr>
+        <w:t xml:space="preserve"> 비활성화.</w:t>
+      </w:r>
+      <w:r>
+        <w:t xml:space="preserve"> </w:t>
+      </w:r>
+      <w:proofErr w:type="spellStart"/>
+      <w:r>
+        <w:t>kubelet</w:t>
+      </w:r>
+      <w:proofErr w:type="spellEnd"/>
+      <w:r>
+        <w:rPr>
+          <w:rFonts w:hint="eastAsia"/>
+        </w:rPr>
+        <w:t xml:space="preserve">이 제대로 작동하게 하려면 반드시 </w:t>
+      </w:r>
+      <w:proofErr w:type="spellStart"/>
+      <w:r>
+        <w:rPr>
+          <w:rFonts w:hint="eastAsia"/>
+        </w:rPr>
+        <w:t>스왑을</w:t>
+      </w:r>
+      <w:proofErr w:type="spellEnd"/>
+      <w:r>
+        <w:rPr>
+          <w:rFonts w:hint="eastAsia"/>
+        </w:rPr>
+        <w:t xml:space="preserve"> 사용하지 않도록 설정한다.</w:t>
       </w:r>
     </w:p>
     <w:p>
@@ -5179,11 +6181,73 @@
       </w:r>
       <w:r>
         <w:br/>
-        <w:t>sudo swapoff -a # 현재 시스템에 적용(리부팅하면 재설정 필요)</w:t>
+      </w:r>
+      <w:proofErr w:type="spellStart"/>
+      <w:r>
+        <w:t>sudo</w:t>
+      </w:r>
+      <w:proofErr w:type="spellEnd"/>
+      <w:r>
+        <w:t xml:space="preserve"> </w:t>
+      </w:r>
+      <w:proofErr w:type="spellStart"/>
+      <w:r>
+        <w:t>swapoff</w:t>
+      </w:r>
+      <w:proofErr w:type="spellEnd"/>
+      <w:r>
+        <w:t xml:space="preserve"> -a # 현재 시스템에 적용(</w:t>
+      </w:r>
+      <w:proofErr w:type="spellStart"/>
+      <w:r>
+        <w:t>리부팅하면</w:t>
+      </w:r>
+      <w:proofErr w:type="spellEnd"/>
+      <w:r>
+        <w:t xml:space="preserve"> 재설정 필요)</w:t>
       </w:r>
       <w:r>
         <w:br/>
-        <w:t>sudo sed -i '/ swap / s/^\(.*\)$/#\1/g' /etc/fstab # 리부팅 필수</w:t>
+      </w:r>
+      <w:proofErr w:type="spellStart"/>
+      <w:r>
+        <w:t>sudo</w:t>
+      </w:r>
+      <w:proofErr w:type="spellEnd"/>
+      <w:r>
+        <w:t xml:space="preserve"> sed -</w:t>
+      </w:r>
+      <w:proofErr w:type="spellStart"/>
+      <w:r>
+        <w:t>i</w:t>
+      </w:r>
+      <w:proofErr w:type="spellEnd"/>
+      <w:r>
+        <w:t xml:space="preserve"> '/ swap / s/^\(.*\)$/#\1/g' /</w:t>
+      </w:r>
+      <w:proofErr w:type="spellStart"/>
+      <w:r>
+        <w:t>etc</w:t>
+      </w:r>
+      <w:proofErr w:type="spellEnd"/>
+      <w:r>
+        <w:t>/</w:t>
+      </w:r>
+      <w:proofErr w:type="spellStart"/>
+      <w:r>
+        <w:t>fstab</w:t>
+      </w:r>
+      <w:proofErr w:type="spellEnd"/>
+      <w:r>
+        <w:t xml:space="preserve"> # </w:t>
+      </w:r>
+      <w:proofErr w:type="spellStart"/>
+      <w:r>
+        <w:t>리부팅</w:t>
+      </w:r>
+      <w:proofErr w:type="spellEnd"/>
+      <w:r>
+        <w:t xml:space="preserve"> 필수</w:t>
       </w:r>
     </w:p>
     <w:p>
@@ -5225,20 +6289,51 @@
           <w:rFonts w:hint="eastAsia"/>
         </w:rPr>
         <w:lastRenderedPageBreak/>
-        <w:t>우분투에 쿠버네티스 설치 및 쿠버네티스 관리하는 명령어</w:t>
-      </w:r>
-    </w:p>
-    <w:p>
-      <w:pPr>
-        <w:rPr>
-          <w:rFonts w:hint="eastAsia"/>
-        </w:rPr>
-      </w:pPr>
-      <w:r>
-        <w:rPr>
-          <w:rFonts w:hint="eastAsia"/>
-        </w:rPr>
-        <w:t xml:space="preserve">쿠버네티스 설치 사이트에서 스크립트를 참조하여 </w:t>
+        <w:t xml:space="preserve">우분투에 </w:t>
+      </w:r>
+      <w:proofErr w:type="spellStart"/>
+      <w:r>
+        <w:rPr>
+          <w:rFonts w:hint="eastAsia"/>
+        </w:rPr>
+        <w:t>쿠버네티스</w:t>
+      </w:r>
+      <w:proofErr w:type="spellEnd"/>
+      <w:r>
+        <w:rPr>
+          <w:rFonts w:hint="eastAsia"/>
+        </w:rPr>
+        <w:t xml:space="preserve"> 설치 및 </w:t>
+      </w:r>
+      <w:proofErr w:type="spellStart"/>
+      <w:r>
+        <w:rPr>
+          <w:rFonts w:hint="eastAsia"/>
+        </w:rPr>
+        <w:t>쿠버네티스</w:t>
+      </w:r>
+      <w:proofErr w:type="spellEnd"/>
+      <w:r>
+        <w:rPr>
+          <w:rFonts w:hint="eastAsia"/>
+        </w:rPr>
+        <w:t xml:space="preserve"> 관리하는 명령어</w:t>
+      </w:r>
+    </w:p>
+    <w:p>
+      <w:proofErr w:type="spellStart"/>
+      <w:r>
+        <w:rPr>
+          <w:rFonts w:hint="eastAsia"/>
+        </w:rPr>
+        <w:t>쿠버네티스</w:t>
+      </w:r>
+      <w:proofErr w:type="spellEnd"/>
+      <w:r>
+        <w:rPr>
+          <w:rFonts w:hint="eastAsia"/>
+        </w:rPr>
+        <w:t xml:space="preserve"> 설치 사이트에서 스크립트를 참조하여 </w:t>
       </w:r>
       <w:r>
         <w:t xml:space="preserve">kube_install.sh </w:t>
@@ -5247,11 +6342,19 @@
         <w:rPr>
           <w:rFonts w:hint="eastAsia"/>
         </w:rPr>
-        <w:t>파일에 작성하고 c</w:t>
+        <w:t xml:space="preserve">파일에 작성하고 </w:t>
+      </w:r>
+      <w:proofErr w:type="spellStart"/>
+      <w:r>
+        <w:rPr>
+          <w:rFonts w:hint="eastAsia"/>
+        </w:rPr>
+        <w:t>c</w:t>
       </w:r>
       <w:r>
         <w:t>hmod</w:t>
       </w:r>
+      <w:proofErr w:type="spellEnd"/>
       <w:r>
         <w:rPr>
           <w:rFonts w:hint="eastAsia"/>
@@ -5270,6 +6373,7 @@
       </w:hyperlink>
     </w:p>
     <w:p>
+      <w:proofErr w:type="spellStart"/>
       <w:r>
         <w:rPr>
           <w:rFonts w:hint="eastAsia"/>
@@ -5277,13 +6381,31 @@
         <w:t>k</w:t>
       </w:r>
       <w:r>
-        <w:t xml:space="preserve">ubeadm: </w:t>
-      </w:r>
-      <w:r>
-        <w:rPr>
-          <w:rFonts w:hint="eastAsia"/>
-        </w:rPr>
-        <w:t>클러스터를 부트스트랩하는 명령어이다.</w:t>
+        <w:t>ubeadm</w:t>
+      </w:r>
+      <w:proofErr w:type="spellEnd"/>
+      <w:r>
+        <w:t xml:space="preserve">: </w:t>
+      </w:r>
+      <w:r>
+        <w:rPr>
+          <w:rFonts w:hint="eastAsia"/>
+        </w:rPr>
+        <w:t xml:space="preserve">클러스터를 </w:t>
+      </w:r>
+      <w:proofErr w:type="spellStart"/>
+      <w:r>
+        <w:rPr>
+          <w:rFonts w:hint="eastAsia"/>
+        </w:rPr>
+        <w:t>부트스트랩하는</w:t>
+      </w:r>
+      <w:proofErr w:type="spellEnd"/>
+      <w:r>
+        <w:rPr>
+          <w:rFonts w:hint="eastAsia"/>
+        </w:rPr>
+        <w:t xml:space="preserve"> 명령어이다.</w:t>
       </w:r>
       <w:r>
         <w:t xml:space="preserve"> </w:t>
@@ -5296,6 +6418,7 @@
       </w:r>
     </w:p>
     <w:p>
+      <w:proofErr w:type="spellStart"/>
       <w:r>
         <w:rPr>
           <w:rFonts w:hint="eastAsia"/>
@@ -5303,30 +6426,52 @@
         <w:t>k</w:t>
       </w:r>
       <w:r>
-        <w:t xml:space="preserve">ubelet: </w:t>
-      </w:r>
-      <w:r>
-        <w:rPr>
-          <w:rFonts w:hint="eastAsia"/>
-        </w:rPr>
-        <w:t>클러스터의 모든 머신에서 실행되는 파트와 컨테이너 시작과 같은 작업을 수행하는 컴포넌트이다.</w:t>
-      </w:r>
-      <w:r>
-        <w:t xml:space="preserve"> </w:t>
-      </w:r>
-      <w:r>
-        <w:rPr>
-          <w:rFonts w:hint="eastAsia"/>
-        </w:rPr>
-        <w:t>데몬으로 동작하며 컨테이너를 관리한다.</w:t>
-      </w:r>
-    </w:p>
-    <w:p>
-      <w:pPr>
-        <w:rPr>
-          <w:rFonts w:hint="eastAsia"/>
-        </w:rPr>
-      </w:pPr>
+        <w:t>ubelet</w:t>
+      </w:r>
+      <w:proofErr w:type="spellEnd"/>
+      <w:r>
+        <w:t xml:space="preserve">: </w:t>
+      </w:r>
+      <w:r>
+        <w:rPr>
+          <w:rFonts w:hint="eastAsia"/>
+        </w:rPr>
+        <w:t xml:space="preserve">클러스터의 모든 </w:t>
+      </w:r>
+      <w:proofErr w:type="spellStart"/>
+      <w:r>
+        <w:rPr>
+          <w:rFonts w:hint="eastAsia"/>
+        </w:rPr>
+        <w:t>머신에서</w:t>
+      </w:r>
+      <w:proofErr w:type="spellEnd"/>
+      <w:r>
+        <w:rPr>
+          <w:rFonts w:hint="eastAsia"/>
+        </w:rPr>
+        <w:t xml:space="preserve"> 실행되는 파트와 컨테이너 시작과 같은 작업을 수행하는 컴포넌트이다.</w:t>
+      </w:r>
+      <w:r>
+        <w:t xml:space="preserve"> </w:t>
+      </w:r>
+      <w:proofErr w:type="spellStart"/>
+      <w:r>
+        <w:rPr>
+          <w:rFonts w:hint="eastAsia"/>
+        </w:rPr>
+        <w:t>데몬으로</w:t>
+      </w:r>
+      <w:proofErr w:type="spellEnd"/>
+      <w:r>
+        <w:rPr>
+          <w:rFonts w:hint="eastAsia"/>
+        </w:rPr>
+        <w:t xml:space="preserve"> 동작하며 컨테이너를 관리한다.</w:t>
+      </w:r>
+    </w:p>
+    <w:p>
+      <w:proofErr w:type="spellStart"/>
       <w:r>
         <w:rPr>
           <w:rFonts w:hint="eastAsia"/>
@@ -5334,7 +6479,11 @@
         <w:t>k</w:t>
       </w:r>
       <w:r>
-        <w:t xml:space="preserve">ubectl: </w:t>
+        <w:t>ubectl</w:t>
+      </w:r>
+      <w:proofErr w:type="spellEnd"/>
+      <w:r>
+        <w:t xml:space="preserve">: </w:t>
       </w:r>
       <w:r>
         <w:rPr>
@@ -5354,6 +6503,7 @@
     </w:p>
     <w:p/>
     <w:p>
+      <w:proofErr w:type="spellStart"/>
       <w:r>
         <w:rPr>
           <w:rFonts w:hint="eastAsia"/>
@@ -5363,6 +6513,7 @@
       <w:r>
         <w:t>ubeadm</w:t>
       </w:r>
+      <w:proofErr w:type="spellEnd"/>
       <w:r>
         <w:rPr>
           <w:rFonts w:hint="eastAsia"/>
@@ -5377,62 +6528,291 @@
     </w:p>
     <w:p>
       <w:r>
-        <w:t># 1. apt 패키지 색인을 업데이트하고, 쿠버네티스 apt 리포지터리를 사용하는 데 필요한 패키지를 설치한다.</w:t>
-      </w:r>
-    </w:p>
-    <w:p>
-      <w:r>
-        <w:t>sudo apt-get update</w:t>
-      </w:r>
-    </w:p>
-    <w:p>
-      <w:r>
-        <w:t>sudo apt-get install -y apt-transport-https ca-certificates curl</w:t>
+        <w:t xml:space="preserve"># 1. apt 패키지 색인을 업데이트하고, </w:t>
+      </w:r>
+      <w:proofErr w:type="spellStart"/>
+      <w:r>
+        <w:t>쿠버네티스</w:t>
+      </w:r>
+      <w:proofErr w:type="spellEnd"/>
+      <w:r>
+        <w:t xml:space="preserve"> apt </w:t>
+      </w:r>
+      <w:proofErr w:type="spellStart"/>
+      <w:r>
+        <w:t>리포지터리를</w:t>
+      </w:r>
+      <w:proofErr w:type="spellEnd"/>
+      <w:r>
+        <w:t xml:space="preserve"> 사용하는 데 필요한 패키지를 설치한다.</w:t>
+      </w:r>
+    </w:p>
+    <w:p>
+      <w:proofErr w:type="spellStart"/>
+      <w:r>
+        <w:t>sudo</w:t>
+      </w:r>
+      <w:proofErr w:type="spellEnd"/>
+      <w:r>
+        <w:t xml:space="preserve"> apt-get update</w:t>
+      </w:r>
+    </w:p>
+    <w:p>
+      <w:proofErr w:type="spellStart"/>
+      <w:r>
+        <w:t>sudo</w:t>
+      </w:r>
+      <w:proofErr w:type="spellEnd"/>
+      <w:r>
+        <w:t xml:space="preserve"> apt-get install -y apt-transport-https ca-certificates curl</w:t>
       </w:r>
     </w:p>
     <w:p/>
     <w:p>
       <w:r>
-        <w:t># 2. 구글 클라우드의 공개 사이닝 키를 다운로드 한다.</w:t>
-      </w:r>
-    </w:p>
-    <w:p>
-      <w:r>
-        <w:t>sudo curl -fsSLo /usr/share/keyrings/kubernetes-archive-keyring.gpg https://packages.cloud.google.com/apt/doc/apt-key.gpg</w:t>
+        <w:t xml:space="preserve"># 2. 구글 클라우드의 공개 </w:t>
+      </w:r>
+      <w:proofErr w:type="spellStart"/>
+      <w:r>
+        <w:t>사이닝</w:t>
+      </w:r>
+      <w:proofErr w:type="spellEnd"/>
+      <w:r>
+        <w:t xml:space="preserve"> 키를 다운로드 한다.</w:t>
+      </w:r>
+    </w:p>
+    <w:p>
+      <w:proofErr w:type="spellStart"/>
+      <w:r>
+        <w:t>sudo</w:t>
+      </w:r>
+      <w:proofErr w:type="spellEnd"/>
+      <w:r>
+        <w:t xml:space="preserve"> curl -</w:t>
+      </w:r>
+      <w:proofErr w:type="spellStart"/>
+      <w:r>
+        <w:t>fsSLo</w:t>
+      </w:r>
+      <w:proofErr w:type="spellEnd"/>
+      <w:r>
+        <w:t xml:space="preserve"> /</w:t>
+      </w:r>
+      <w:proofErr w:type="spellStart"/>
+      <w:r>
+        <w:t>usr</w:t>
+      </w:r>
+      <w:proofErr w:type="spellEnd"/>
+      <w:r>
+        <w:t>/share/keyrings/</w:t>
+      </w:r>
+      <w:proofErr w:type="spellStart"/>
+      <w:r>
+        <w:t>kubernetes</w:t>
+      </w:r>
+      <w:proofErr w:type="spellEnd"/>
+      <w:r>
+        <w:t>-archive-</w:t>
+      </w:r>
+      <w:proofErr w:type="spellStart"/>
+      <w:r>
+        <w:t>keyring.gpg</w:t>
+      </w:r>
+      <w:proofErr w:type="spellEnd"/>
+      <w:r>
+        <w:t xml:space="preserve"> https://packages.cloud.google.com/apt/doc/apt-key.gpg</w:t>
       </w:r>
     </w:p>
     <w:p/>
     <w:p>
       <w:r>
-        <w:t># 3. 쿠버네티스 apt 리포지터리를 추가한다.</w:t>
-      </w:r>
-    </w:p>
-    <w:p>
-      <w:r>
-        <w:t>echo "deb [signed-by=/usr/share/keyrings/kubernetes-archive-keyring.gpg] https://apt.kubernetes.io/ kubernetes-xenial main" | sudo tee /etc/apt/sources.list.d/kubernetes.list</w:t>
-      </w:r>
+        <w:t xml:space="preserve"># 3. </w:t>
+      </w:r>
+      <w:proofErr w:type="spellStart"/>
+      <w:r>
+        <w:t>쿠버네티스</w:t>
+      </w:r>
+      <w:proofErr w:type="spellEnd"/>
+      <w:r>
+        <w:t xml:space="preserve"> apt </w:t>
+      </w:r>
+      <w:proofErr w:type="spellStart"/>
+      <w:r>
+        <w:t>리포지터리를</w:t>
+      </w:r>
+      <w:proofErr w:type="spellEnd"/>
+      <w:r>
+        <w:t xml:space="preserve"> 추가한다.</w:t>
+      </w:r>
+    </w:p>
+    <w:p>
+      <w:r>
+        <w:t>echo "deb [signed-by=/</w:t>
+      </w:r>
+      <w:proofErr w:type="spellStart"/>
+      <w:r>
+        <w:t>usr</w:t>
+      </w:r>
+      <w:proofErr w:type="spellEnd"/>
+      <w:r>
+        <w:t>/share/keyrings/</w:t>
+      </w:r>
+      <w:proofErr w:type="spellStart"/>
+      <w:r>
+        <w:t>kubernetes</w:t>
+      </w:r>
+      <w:proofErr w:type="spellEnd"/>
+      <w:r>
+        <w:t>-archive-</w:t>
+      </w:r>
+      <w:proofErr w:type="spellStart"/>
+      <w:r>
+        <w:t>keyring.gpg</w:t>
+      </w:r>
+      <w:proofErr w:type="spellEnd"/>
+      <w:r>
+        <w:t xml:space="preserve">] https://apt.kubernetes.io/ </w:t>
+      </w:r>
+      <w:proofErr w:type="spellStart"/>
+      <w:r>
+        <w:t>kubernetes-xenial</w:t>
+      </w:r>
+      <w:proofErr w:type="spellEnd"/>
+      <w:r>
+        <w:t xml:space="preserve"> main" | </w:t>
+      </w:r>
+      <w:proofErr w:type="spellStart"/>
+      <w:r>
+        <w:t>sudo</w:t>
+      </w:r>
+      <w:proofErr w:type="spellEnd"/>
+      <w:r>
+        <w:t xml:space="preserve"> tee /</w:t>
+      </w:r>
+      <w:proofErr w:type="spellStart"/>
+      <w:r>
+        <w:t>etc</w:t>
+      </w:r>
+      <w:proofErr w:type="spellEnd"/>
+      <w:r>
+        <w:t>/apt/</w:t>
+      </w:r>
+      <w:proofErr w:type="spellStart"/>
+      <w:r>
+        <w:t>sources.list.d</w:t>
+      </w:r>
+      <w:proofErr w:type="spellEnd"/>
+      <w:r>
+        <w:t>/</w:t>
+      </w:r>
+      <w:proofErr w:type="spellStart"/>
+      <w:r>
+        <w:t>kubernetes.list</w:t>
+      </w:r>
+      <w:proofErr w:type="spellEnd"/>
     </w:p>
     <w:p/>
     <w:p>
       <w:r>
-        <w:t># 4. apt 패키지 색인을 업데이트하고, kubelet, kubeadm, kubectl을 설치하고 해당 버전을 고정한다.</w:t>
-      </w:r>
-    </w:p>
-    <w:p>
-      <w:r>
-        <w:t>sudo apt-get update</w:t>
-      </w:r>
-    </w:p>
-    <w:p>
+        <w:t xml:space="preserve"># 4. apt 패키지 색인을 업데이트하고, </w:t>
+      </w:r>
+      <w:proofErr w:type="spellStart"/>
+      <w:r>
+        <w:t>kubelet</w:t>
+      </w:r>
+      <w:proofErr w:type="spellEnd"/>
+      <w:r>
+        <w:t xml:space="preserve">, </w:t>
+      </w:r>
+      <w:proofErr w:type="spellStart"/>
+      <w:r>
+        <w:t>kubeadm</w:t>
+      </w:r>
+      <w:proofErr w:type="spellEnd"/>
+      <w:r>
+        <w:t xml:space="preserve">, </w:t>
+      </w:r>
+      <w:proofErr w:type="spellStart"/>
+      <w:r>
+        <w:t>kubectl</w:t>
+      </w:r>
+      <w:proofErr w:type="spellEnd"/>
+      <w:r>
+        <w:t>을 설치하고 해당 버전을 고정한다.</w:t>
+      </w:r>
+    </w:p>
+    <w:p>
+      <w:proofErr w:type="spellStart"/>
+      <w:r>
+        <w:t>sudo</w:t>
+      </w:r>
+      <w:proofErr w:type="spellEnd"/>
+      <w:r>
+        <w:t xml:space="preserve"> apt-get update</w:t>
+      </w:r>
+    </w:p>
+    <w:p>
+      <w:proofErr w:type="spellStart"/>
       <w:r>
         <w:lastRenderedPageBreak/>
-        <w:t>sudo apt-get install -y kubelet kubeadm kubectl</w:t>
-      </w:r>
-    </w:p>
-    <w:p>
-      <w:r>
-        <w:t>sudo apt-mark hold kubelet kubeadm kubectl</w:t>
-      </w:r>
+        <w:t>sudo</w:t>
+      </w:r>
+      <w:proofErr w:type="spellEnd"/>
+      <w:r>
+        <w:t xml:space="preserve"> apt-get install -y </w:t>
+      </w:r>
+      <w:proofErr w:type="spellStart"/>
+      <w:r>
+        <w:t>kubelet</w:t>
+      </w:r>
+      <w:proofErr w:type="spellEnd"/>
+      <w:r>
+        <w:t xml:space="preserve"> </w:t>
+      </w:r>
+      <w:proofErr w:type="spellStart"/>
+      <w:r>
+        <w:t>kubeadm</w:t>
+      </w:r>
+      <w:proofErr w:type="spellEnd"/>
+      <w:r>
+        <w:t xml:space="preserve"> </w:t>
+      </w:r>
+      <w:proofErr w:type="spellStart"/>
+      <w:r>
+        <w:t>kubectl</w:t>
+      </w:r>
+      <w:proofErr w:type="spellEnd"/>
+    </w:p>
+    <w:p>
+      <w:proofErr w:type="spellStart"/>
+      <w:r>
+        <w:t>sudo</w:t>
+      </w:r>
+      <w:proofErr w:type="spellEnd"/>
+      <w:r>
+        <w:t xml:space="preserve"> apt-mark hold </w:t>
+      </w:r>
+      <w:proofErr w:type="spellStart"/>
+      <w:r>
+        <w:t>kubelet</w:t>
+      </w:r>
+      <w:proofErr w:type="spellEnd"/>
+      <w:r>
+        <w:t xml:space="preserve"> </w:t>
+      </w:r>
+      <w:proofErr w:type="spellStart"/>
+      <w:r>
+        <w:t>kubeadm</w:t>
+      </w:r>
+      <w:proofErr w:type="spellEnd"/>
+      <w:r>
+        <w:t xml:space="preserve"> </w:t>
+      </w:r>
+      <w:proofErr w:type="spellStart"/>
+      <w:r>
+        <w:t>kubectl</w:t>
+      </w:r>
+      <w:proofErr w:type="spellEnd"/>
     </w:p>
     <w:p>
       <w:r>
@@ -5441,24 +6821,46 @@
     </w:p>
     <w:p/>
     <w:p>
-      <w:pPr>
-        <w:rPr>
-          <w:rFonts w:hint="eastAsia"/>
-        </w:rPr>
-      </w:pPr>
-      <w:r>
-        <w:t>sudo bash kube_install.sh</w:t>
+      <w:proofErr w:type="spellStart"/>
+      <w:r>
+        <w:t>sudo</w:t>
+      </w:r>
+      <w:proofErr w:type="spellEnd"/>
+      <w:r>
+        <w:t xml:space="preserve"> bash kube_install.sh</w:t>
       </w:r>
     </w:p>
     <w:p>
       <w:pPr>
         <w:pStyle w:val="2"/>
       </w:pPr>
-      <w:r>
-        <w:rPr>
-          <w:rFonts w:hint="eastAsia"/>
-        </w:rPr>
-        <w:t>넷필터 브릿지 설정</w:t>
+      <w:proofErr w:type="spellStart"/>
+      <w:r>
+        <w:rPr>
+          <w:rFonts w:hint="eastAsia"/>
+        </w:rPr>
+        <w:t>넷필터</w:t>
+      </w:r>
+      <w:proofErr w:type="spellEnd"/>
+      <w:r>
+        <w:rPr>
+          <w:rFonts w:hint="eastAsia"/>
+        </w:rPr>
+        <w:t xml:space="preserve"> </w:t>
+      </w:r>
+      <w:proofErr w:type="spellStart"/>
+      <w:r>
+        <w:rPr>
+          <w:rFonts w:hint="eastAsia"/>
+        </w:rPr>
+        <w:t>브릿지</w:t>
+      </w:r>
+      <w:proofErr w:type="spellEnd"/>
+      <w:r>
+        <w:rPr>
+          <w:rFonts w:hint="eastAsia"/>
+        </w:rPr>
+        <w:t xml:space="preserve"> 설정</w:t>
       </w:r>
     </w:p>
     <w:p>
@@ -5475,27 +6877,88 @@
         <w:rPr>
           <w:rFonts w:hint="eastAsia"/>
         </w:rPr>
-        <w:t>가 아닌 컨테이너D를 직접 설치하기 때문에 모든 노드에 다음 명령으로 넷필터 브릿지를 설정한다.</w:t>
-      </w:r>
-    </w:p>
-    <w:p>
-      <w:r>
-        <w:t>sudo -i</w:t>
-      </w:r>
-    </w:p>
-    <w:p>
-      <w:r>
-        <w:t>modprobe br_netfilter</w:t>
-      </w:r>
-    </w:p>
-    <w:p>
-      <w:r>
-        <w:t>echo 1 &gt; /proc/sys/net/ipv4/ip_forward</w:t>
-      </w:r>
-    </w:p>
-    <w:p>
-      <w:r>
-        <w:t>echo 1 &gt; /proc/sys/net/bridge/bridge-nf-call-iptables</w:t>
+        <w:t xml:space="preserve">가 아닌 컨테이너D를 직접 설치하기 때문에 모든 노드에 다음 명령으로 </w:t>
+      </w:r>
+      <w:proofErr w:type="spellStart"/>
+      <w:r>
+        <w:rPr>
+          <w:rFonts w:hint="eastAsia"/>
+        </w:rPr>
+        <w:t>넷필터</w:t>
+      </w:r>
+      <w:proofErr w:type="spellEnd"/>
+      <w:r>
+        <w:rPr>
+          <w:rFonts w:hint="eastAsia"/>
+        </w:rPr>
+        <w:t xml:space="preserve"> </w:t>
+      </w:r>
+      <w:proofErr w:type="spellStart"/>
+      <w:r>
+        <w:rPr>
+          <w:rFonts w:hint="eastAsia"/>
+        </w:rPr>
+        <w:t>브릿지를</w:t>
+      </w:r>
+      <w:proofErr w:type="spellEnd"/>
+      <w:r>
+        <w:rPr>
+          <w:rFonts w:hint="eastAsia"/>
+        </w:rPr>
+        <w:t xml:space="preserve"> 설정한다.</w:t>
+      </w:r>
+    </w:p>
+    <w:p>
+      <w:proofErr w:type="spellStart"/>
+      <w:r>
+        <w:t>sudo</w:t>
+      </w:r>
+      <w:proofErr w:type="spellEnd"/>
+      <w:r>
+        <w:t xml:space="preserve"> -</w:t>
+      </w:r>
+      <w:proofErr w:type="spellStart"/>
+      <w:r>
+        <w:t>i</w:t>
+      </w:r>
+      <w:proofErr w:type="spellEnd"/>
+    </w:p>
+    <w:p>
+      <w:proofErr w:type="spellStart"/>
+      <w:r>
+        <w:t>modprobe</w:t>
+      </w:r>
+      <w:proofErr w:type="spellEnd"/>
+      <w:r>
+        <w:t xml:space="preserve"> </w:t>
+      </w:r>
+      <w:proofErr w:type="spellStart"/>
+      <w:r>
+        <w:t>br_netfilter</w:t>
+      </w:r>
+      <w:proofErr w:type="spellEnd"/>
+    </w:p>
+    <w:p>
+      <w:r>
+        <w:t>echo 1 &gt; /proc/sys/net/ipv4/</w:t>
+      </w:r>
+      <w:proofErr w:type="spellStart"/>
+      <w:r>
+        <w:t>ip_forward</w:t>
+      </w:r>
+      <w:proofErr w:type="spellEnd"/>
+    </w:p>
+    <w:p>
+      <w:r>
+        <w:t>echo 1 &gt; /proc/sys/net/bridge/bridge-</w:t>
+      </w:r>
+      <w:proofErr w:type="spellStart"/>
+      <w:r>
+        <w:t>nf</w:t>
+      </w:r>
+      <w:proofErr w:type="spellEnd"/>
+      <w:r>
+        <w:t>-call-iptables</w:t>
       </w:r>
     </w:p>
     <w:p>
@@ -5573,6 +7036,7 @@
         </w:numPr>
         <w:ind w:leftChars="0"/>
       </w:pPr>
+      <w:proofErr w:type="spellStart"/>
       <w:r>
         <w:rPr>
           <w:rFonts w:hint="eastAsia"/>
@@ -5580,7 +7044,19 @@
         <w:t>m</w:t>
       </w:r>
       <w:r>
-        <w:t xml:space="preserve">odprobe br_netfilter </w:t>
+        <w:t>odprobe</w:t>
+      </w:r>
+      <w:proofErr w:type="spellEnd"/>
+      <w:r>
+        <w:t xml:space="preserve"> </w:t>
+      </w:r>
+      <w:proofErr w:type="spellStart"/>
+      <w:r>
+        <w:t>br_netfilter</w:t>
+      </w:r>
+      <w:proofErr w:type="spellEnd"/>
+      <w:r>
+        <w:t xml:space="preserve"> </w:t>
       </w:r>
       <w:r>
         <w:rPr>
@@ -5608,8 +7084,13 @@
         <w:ind w:leftChars="0"/>
       </w:pPr>
       <w:r>
-        <w:t>echo 1 &gt; /proc/sys/net/ipv4/ip_forward</w:t>
-      </w:r>
+        <w:t>echo 1 &gt; /proc/sys/net/ipv4/</w:t>
+      </w:r>
+      <w:proofErr w:type="spellStart"/>
+      <w:r>
+        <w:t>ip_forward</w:t>
+      </w:r>
+      <w:proofErr w:type="spellEnd"/>
       <w:r>
         <w:rPr>
           <w:rFonts w:hint="eastAsia"/>
@@ -5643,15 +7124,17 @@
           <w:numId w:val="17"/>
         </w:numPr>
         <w:ind w:leftChars="0"/>
-        <w:rPr>
-          <w:rFonts w:hint="eastAsia"/>
-        </w:rPr>
-      </w:pPr>
-      <w:r>
-        <w:t>echo 1 &gt; /proc/sys/net/bridge/bridge-nf-call-iptables</w:t>
-      </w:r>
-      <w:r>
-        <w:t xml:space="preserve"> </w:t>
+      </w:pPr>
+      <w:r>
+        <w:t>echo 1 &gt; /proc/sys/net/bridge/bridge-</w:t>
+      </w:r>
+      <w:proofErr w:type="spellStart"/>
+      <w:r>
+        <w:t>nf</w:t>
+      </w:r>
+      <w:proofErr w:type="spellEnd"/>
+      <w:r>
+        <w:t xml:space="preserve">-call-iptables </w:t>
       </w:r>
       <w:r>
         <w:rPr>
@@ -5696,6 +7179,7 @@
         <w:rPr>
           <w:rFonts w:hint="eastAsia"/>
         </w:rPr>
+        <w:lastRenderedPageBreak/>
         <w:t xml:space="preserve">우분투 환경으로 클러스터 구성 설명 </w:t>
       </w:r>
       <w:r>
@@ -5706,6 +7190,918 @@
           <w:rFonts w:hint="eastAsia"/>
         </w:rPr>
         <w:t>클러스터 설정</w:t>
+      </w:r>
+    </w:p>
+    <w:p>
+      <w:pPr>
+        <w:pStyle w:val="2"/>
+      </w:pPr>
+      <w:r>
+        <w:rPr>
+          <w:rFonts w:hint="eastAsia"/>
+        </w:rPr>
+        <w:t>마스터 노드 초기화</w:t>
+      </w:r>
+    </w:p>
+    <w:p>
+      <w:r>
+        <w:t>‘</w:t>
+      </w:r>
+      <w:r>
+        <w:rPr>
+          <w:rFonts w:hint="eastAsia"/>
+        </w:rPr>
+        <w:t>마스터 노드</w:t>
+      </w:r>
+      <w:r>
+        <w:t>’</w:t>
+      </w:r>
+      <w:r>
+        <w:rPr>
+          <w:rFonts w:hint="eastAsia"/>
+        </w:rPr>
+        <w:t xml:space="preserve">에서 </w:t>
+      </w:r>
+      <w:proofErr w:type="spellStart"/>
+      <w:r>
+        <w:t>init</w:t>
+      </w:r>
+      <w:proofErr w:type="spellEnd"/>
+      <w:r>
+        <w:t xml:space="preserve"> </w:t>
+      </w:r>
+      <w:r>
+        <w:rPr>
+          <w:rFonts w:hint="eastAsia"/>
+        </w:rPr>
+        <w:t>작업을 시작하기 위해 다음 명령어를 작성한다.</w:t>
+      </w:r>
+    </w:p>
+    <w:p>
+      <w:proofErr w:type="spellStart"/>
+      <w:r>
+        <w:rPr>
+          <w:rFonts w:hint="eastAsia"/>
+        </w:rPr>
+        <w:t>s</w:t>
+      </w:r>
+      <w:r>
+        <w:t>udo</w:t>
+      </w:r>
+      <w:proofErr w:type="spellEnd"/>
+      <w:r>
+        <w:t xml:space="preserve"> </w:t>
+      </w:r>
+      <w:proofErr w:type="spellStart"/>
+      <w:r>
+        <w:t>kubeadm</w:t>
+      </w:r>
+      <w:proofErr w:type="spellEnd"/>
+      <w:r>
+        <w:t xml:space="preserve"> </w:t>
+      </w:r>
+      <w:proofErr w:type="spellStart"/>
+      <w:r>
+        <w:t>init</w:t>
+      </w:r>
+      <w:proofErr w:type="spellEnd"/>
+    </w:p>
+    <w:p>
+      <w:r>
+        <w:rPr>
+          <w:rFonts w:hint="eastAsia"/>
+        </w:rPr>
+        <w:t>m</w:t>
+      </w:r>
+      <w:r>
+        <w:t xml:space="preserve">aster </w:t>
+      </w:r>
+      <w:r>
+        <w:rPr>
+          <w:rFonts w:hint="eastAsia"/>
+        </w:rPr>
+        <w:t>노드 초기화 성공 시 다음과 같은 메시지가 출력된다.</w:t>
+      </w:r>
+    </w:p>
+    <w:p>
+      <w:r>
+        <w:t>Your Kubernetes control-plane has initialized successfully!</w:t>
+      </w:r>
+    </w:p>
+    <w:p>
+      <w:r>
+        <w:t>To start using your cluster, you need to run the following as a regular user:</w:t>
+      </w:r>
+    </w:p>
+    <w:p>
+      <w:proofErr w:type="spellStart"/>
+      <w:r>
+        <w:t>mkdir</w:t>
+      </w:r>
+      <w:proofErr w:type="spellEnd"/>
+      <w:r>
+        <w:t>-p $HOME/.</w:t>
+      </w:r>
+      <w:proofErr w:type="spellStart"/>
+      <w:r>
+        <w:t>kube</w:t>
+      </w:r>
+      <w:proofErr w:type="spellEnd"/>
+    </w:p>
+    <w:p>
+      <w:proofErr w:type="spellStart"/>
+      <w:r>
+        <w:t>sudo</w:t>
+      </w:r>
+      <w:proofErr w:type="spellEnd"/>
+      <w:r>
+        <w:t xml:space="preserve"> cp-</w:t>
+      </w:r>
+      <w:proofErr w:type="spellStart"/>
+      <w:r>
+        <w:t>i</w:t>
+      </w:r>
+      <w:proofErr w:type="spellEnd"/>
+      <w:r>
+        <w:t xml:space="preserve"> /</w:t>
+      </w:r>
+      <w:proofErr w:type="spellStart"/>
+      <w:r>
+        <w:t>etc</w:t>
+      </w:r>
+      <w:proofErr w:type="spellEnd"/>
+      <w:r>
+        <w:t>/</w:t>
+      </w:r>
+      <w:proofErr w:type="spellStart"/>
+      <w:r>
+        <w:t>kubernetes</w:t>
+      </w:r>
+      <w:proofErr w:type="spellEnd"/>
+      <w:r>
+        <w:t>/</w:t>
+      </w:r>
+      <w:proofErr w:type="spellStart"/>
+      <w:r>
+        <w:t>admin.conf</w:t>
+      </w:r>
+      <w:proofErr w:type="spellEnd"/>
+      <w:r>
+        <w:t xml:space="preserve"> $HOME/.</w:t>
+      </w:r>
+      <w:proofErr w:type="spellStart"/>
+      <w:r>
+        <w:t>kube</w:t>
+      </w:r>
+      <w:proofErr w:type="spellEnd"/>
+      <w:r>
+        <w:t>/config</w:t>
+      </w:r>
+    </w:p>
+    <w:p>
+      <w:proofErr w:type="spellStart"/>
+      <w:r>
+        <w:t>sudo</w:t>
+      </w:r>
+      <w:proofErr w:type="spellEnd"/>
+      <w:r>
+        <w:t xml:space="preserve"> </w:t>
+      </w:r>
+      <w:proofErr w:type="spellStart"/>
+      <w:r>
+        <w:t>chown</w:t>
+      </w:r>
+      <w:proofErr w:type="spellEnd"/>
+      <w:r>
+        <w:t xml:space="preserve"> $(id-u):$(id-g) $HOME/.</w:t>
+      </w:r>
+      <w:proofErr w:type="spellStart"/>
+      <w:r>
+        <w:t>kube</w:t>
+      </w:r>
+      <w:proofErr w:type="spellEnd"/>
+      <w:r>
+        <w:t>/config</w:t>
+      </w:r>
+    </w:p>
+    <w:p>
+      <w:r>
+        <w:t>You should now deploy a pod network to the cluster.</w:t>
+      </w:r>
+    </w:p>
+    <w:p>
+      <w:r>
+        <w:t>Run "</w:t>
+      </w:r>
+      <w:proofErr w:type="spellStart"/>
+      <w:r>
+        <w:t>kubectl</w:t>
+      </w:r>
+      <w:proofErr w:type="spellEnd"/>
+      <w:r>
+        <w:t xml:space="preserve"> apply-f [</w:t>
+      </w:r>
+      <w:proofErr w:type="spellStart"/>
+      <w:r>
+        <w:t>podnetwork</w:t>
+      </w:r>
+      <w:proofErr w:type="spellEnd"/>
+      <w:r>
+        <w:t>].</w:t>
+      </w:r>
+      <w:proofErr w:type="spellStart"/>
+      <w:r>
+        <w:t>yaml</w:t>
+      </w:r>
+      <w:proofErr w:type="spellEnd"/>
+      <w:r>
+        <w:t>" with one of the options listed at:</w:t>
+      </w:r>
+    </w:p>
+    <w:p>
+      <w:hyperlink r:id="rId53" w:history="1">
+        <w:r>
+          <w:rPr>
+            <w:rStyle w:val="a4"/>
+          </w:rPr>
+          <w:t>https://kubernetes.io/docs/concepts/cluster-administration/addons/</w:t>
+        </w:r>
+      </w:hyperlink>
+    </w:p>
+    <w:p>
+      <w:r>
+        <w:t>Then you can join any number of worker nodes by running the following on each as root:</w:t>
+      </w:r>
+    </w:p>
+    <w:p>
+      <w:proofErr w:type="spellStart"/>
+      <w:r>
+        <w:t>kubeadm</w:t>
+      </w:r>
+      <w:proofErr w:type="spellEnd"/>
+      <w:r>
+        <w:t xml:space="preserve"> join 10.0.2.15:6443 --token dwaoa1.4nf7b81nsfnkxctw \</w:t>
+      </w:r>
+    </w:p>
+    <w:p>
+      <w:r>
+        <w:t>--discovery-token-ca-cert-hash</w:t>
+      </w:r>
+    </w:p>
+    <w:p>
+      <w:r>
+        <w:t>sha256:b16367e80df58c3dbacfc3961126ae82d68519368d345fdb228addf04cb4ea2f</w:t>
+      </w:r>
+    </w:p>
+    <w:p>
+      <w:pPr>
+        <w:pStyle w:val="2"/>
+      </w:pPr>
+      <w:r>
+        <w:rPr>
+          <w:rFonts w:hint="eastAsia"/>
+        </w:rPr>
+        <w:t>클러스터를 사용 초기 세팅(마스터 노드에서만 진행하기)</w:t>
+      </w:r>
+    </w:p>
+    <w:p>
+      <w:r>
+        <w:rPr>
+          <w:rFonts w:hint="eastAsia"/>
+        </w:rPr>
+        <w:t xml:space="preserve">다음을 일반 사용자 계정으로 실행(콘솔에 출력된 메시지를 </w:t>
+      </w:r>
+      <w:proofErr w:type="spellStart"/>
+      <w:r>
+        <w:rPr>
+          <w:rFonts w:hint="eastAsia"/>
+        </w:rPr>
+        <w:t>복붙</w:t>
+      </w:r>
+      <w:proofErr w:type="spellEnd"/>
+      <w:r>
+        <w:rPr>
+          <w:rFonts w:hint="eastAsia"/>
+        </w:rPr>
+        <w:t>)</w:t>
+      </w:r>
+    </w:p>
+    <w:p>
+      <w:proofErr w:type="spellStart"/>
+      <w:r>
+        <w:t>mkdir</w:t>
+      </w:r>
+      <w:proofErr w:type="spellEnd"/>
+      <w:r>
+        <w:t>-p $HOME/.</w:t>
+      </w:r>
+      <w:proofErr w:type="spellStart"/>
+      <w:r>
+        <w:t>kube</w:t>
+      </w:r>
+      <w:proofErr w:type="spellEnd"/>
+    </w:p>
+    <w:p>
+      <w:proofErr w:type="spellStart"/>
+      <w:r>
+        <w:t>sudo</w:t>
+      </w:r>
+      <w:proofErr w:type="spellEnd"/>
+      <w:r>
+        <w:t xml:space="preserve"> cp-</w:t>
+      </w:r>
+      <w:proofErr w:type="spellStart"/>
+      <w:r>
+        <w:t>i</w:t>
+      </w:r>
+      <w:proofErr w:type="spellEnd"/>
+      <w:r>
+        <w:t xml:space="preserve"> /</w:t>
+      </w:r>
+      <w:proofErr w:type="spellStart"/>
+      <w:r>
+        <w:t>etc</w:t>
+      </w:r>
+      <w:proofErr w:type="spellEnd"/>
+      <w:r>
+        <w:t>/</w:t>
+      </w:r>
+      <w:proofErr w:type="spellStart"/>
+      <w:r>
+        <w:t>kubernetes</w:t>
+      </w:r>
+      <w:proofErr w:type="spellEnd"/>
+      <w:r>
+        <w:t>/</w:t>
+      </w:r>
+      <w:proofErr w:type="spellStart"/>
+      <w:r>
+        <w:t>admin.conf</w:t>
+      </w:r>
+      <w:proofErr w:type="spellEnd"/>
+      <w:r>
+        <w:t xml:space="preserve"> $HOME/.</w:t>
+      </w:r>
+      <w:proofErr w:type="spellStart"/>
+      <w:r>
+        <w:t>kube</w:t>
+      </w:r>
+      <w:proofErr w:type="spellEnd"/>
+      <w:r>
+        <w:t>/config</w:t>
+      </w:r>
+    </w:p>
+    <w:p>
+      <w:proofErr w:type="spellStart"/>
+      <w:r>
+        <w:t>sudo</w:t>
+      </w:r>
+      <w:proofErr w:type="spellEnd"/>
+      <w:r>
+        <w:t xml:space="preserve"> </w:t>
+      </w:r>
+      <w:proofErr w:type="spellStart"/>
+      <w:r>
+        <w:t>chown</w:t>
+      </w:r>
+      <w:proofErr w:type="spellEnd"/>
+      <w:r>
+        <w:t xml:space="preserve"> $(id-u):$(id-g) $HOME/.</w:t>
+      </w:r>
+      <w:proofErr w:type="spellStart"/>
+      <w:r>
+        <w:t>kube</w:t>
+      </w:r>
+      <w:proofErr w:type="spellEnd"/>
+      <w:r>
+        <w:t>/config</w:t>
+      </w:r>
+    </w:p>
+    <w:p>
+      <w:pPr>
+        <w:pStyle w:val="2"/>
+      </w:pPr>
+      <w:r>
+        <w:rPr>
+          <w:rFonts w:hint="eastAsia"/>
+        </w:rPr>
+        <w:t>워커 노드 추가(워커 노드에서만 할 것)</w:t>
+      </w:r>
+    </w:p>
+    <w:p>
+      <w:r>
+        <w:rPr>
+          <w:rFonts w:hint="eastAsia"/>
+        </w:rPr>
+        <w:t xml:space="preserve">앞서 설치한 대로 </w:t>
+      </w:r>
+      <w:proofErr w:type="spellStart"/>
+      <w:r>
+        <w:rPr>
+          <w:rFonts w:hint="eastAsia"/>
+        </w:rPr>
+        <w:t>쿠버네티스</w:t>
+      </w:r>
+      <w:proofErr w:type="spellEnd"/>
+      <w:r>
+        <w:rPr>
+          <w:rFonts w:hint="eastAsia"/>
+        </w:rPr>
+        <w:t xml:space="preserve"> 설치한 후 </w:t>
+      </w:r>
+      <w:proofErr w:type="spellStart"/>
+      <w:r>
+        <w:t>init</w:t>
+      </w:r>
+      <w:proofErr w:type="spellEnd"/>
+      <w:r>
+        <w:t xml:space="preserve"> </w:t>
+      </w:r>
+      <w:r>
+        <w:rPr>
+          <w:rFonts w:hint="eastAsia"/>
+        </w:rPr>
+        <w:t xml:space="preserve">명령어 </w:t>
+      </w:r>
+      <w:proofErr w:type="spellStart"/>
+      <w:r>
+        <w:rPr>
+          <w:rFonts w:hint="eastAsia"/>
+        </w:rPr>
+        <w:t>전까지만</w:t>
+      </w:r>
+      <w:proofErr w:type="spellEnd"/>
+      <w:r>
+        <w:rPr>
+          <w:rFonts w:hint="eastAsia"/>
+        </w:rPr>
+        <w:t xml:space="preserve"> 수행</w:t>
+      </w:r>
+    </w:p>
+    <w:p>
+      <w:r>
+        <w:rPr>
+          <w:rFonts w:hint="eastAsia"/>
+        </w:rPr>
+        <w:t xml:space="preserve">이후 각 노드에서 관리자 권한으로 워커 노드를 참가 시키기(콘솔에 출력된 메시지를 </w:t>
+      </w:r>
+      <w:proofErr w:type="spellStart"/>
+      <w:r>
+        <w:rPr>
+          <w:rFonts w:hint="eastAsia"/>
+        </w:rPr>
+        <w:t>복붙</w:t>
+      </w:r>
+      <w:proofErr w:type="spellEnd"/>
+      <w:r>
+        <w:rPr>
+          <w:rFonts w:hint="eastAsia"/>
+        </w:rPr>
+        <w:t>)</w:t>
+      </w:r>
+    </w:p>
+    <w:p>
+      <w:proofErr w:type="spellStart"/>
+      <w:r>
+        <w:rPr>
+          <w:rFonts w:hint="eastAsia"/>
+        </w:rPr>
+        <w:lastRenderedPageBreak/>
+        <w:t>s</w:t>
+      </w:r>
+      <w:r>
+        <w:t>udo</w:t>
+      </w:r>
+      <w:proofErr w:type="spellEnd"/>
+      <w:r>
+        <w:t xml:space="preserve"> </w:t>
+      </w:r>
+      <w:proofErr w:type="spellStart"/>
+      <w:r>
+        <w:t>kubeadm</w:t>
+      </w:r>
+      <w:proofErr w:type="spellEnd"/>
+      <w:r>
+        <w:t xml:space="preserve"> join 10.0.2.15:6443 --token dwaoa1.4nf7b81nsfnkxctw \</w:t>
+      </w:r>
+    </w:p>
+    <w:p>
+      <w:r>
+        <w:t>--discovery-token-ca-cert-hash</w:t>
+      </w:r>
+    </w:p>
+    <w:p>
+      <w:r>
+        <w:t>sha256:b16367e80df58c3dbacfc3961126ae82d68519368d345fdb228addf04cb4ea2f</w:t>
+      </w:r>
+    </w:p>
+    <w:p>
+      <w:pPr>
+        <w:pStyle w:val="2"/>
+      </w:pPr>
+      <w:r>
+        <w:rPr>
+          <w:rFonts w:hint="eastAsia"/>
+        </w:rPr>
+        <w:t>연결된 노드들의 상태 확인하기</w:t>
+      </w:r>
+    </w:p>
+    <w:p>
+      <w:proofErr w:type="spellStart"/>
+      <w:r>
+        <w:rPr>
+          <w:rFonts w:hint="eastAsia"/>
+        </w:rPr>
+        <w:t>k</w:t>
+      </w:r>
+      <w:r>
+        <w:t>ubectl</w:t>
+      </w:r>
+      <w:proofErr w:type="spellEnd"/>
+      <w:r>
+        <w:t xml:space="preserve"> get nodes</w:t>
+      </w:r>
+      <w:r>
+        <w:rPr>
+          <w:rFonts w:hint="eastAsia"/>
+        </w:rPr>
+        <w:t>를 사용하여 상태를 확인할 수 있다.</w:t>
+      </w:r>
+    </w:p>
+    <w:p>
+      <w:r>
+        <w:t>STATUS</w:t>
+      </w:r>
+      <w:r>
+        <w:rPr>
+          <w:rFonts w:hint="eastAsia"/>
+        </w:rPr>
+        <w:t xml:space="preserve"> 값이 </w:t>
+      </w:r>
+      <w:proofErr w:type="spellStart"/>
+      <w:r>
+        <w:t>NotReady</w:t>
+      </w:r>
+      <w:proofErr w:type="spellEnd"/>
+      <w:r>
+        <w:t xml:space="preserve"> </w:t>
+      </w:r>
+      <w:r>
+        <w:rPr>
+          <w:rFonts w:hint="eastAsia"/>
+        </w:rPr>
+        <w:t>상태는 P</w:t>
+      </w:r>
+      <w:r>
+        <w:t>od Network</w:t>
+      </w:r>
+      <w:r>
+        <w:rPr>
+          <w:rFonts w:hint="eastAsia"/>
+        </w:rPr>
+        <w:t xml:space="preserve">가 </w:t>
+      </w:r>
+      <w:r>
+        <w:t>deploy</w:t>
+      </w:r>
+      <w:r>
+        <w:rPr>
+          <w:rFonts w:hint="eastAsia"/>
+        </w:rPr>
+        <w:t xml:space="preserve">되면 </w:t>
+      </w:r>
+      <w:r>
+        <w:t>Ready</w:t>
+      </w:r>
+      <w:r>
+        <w:rPr>
+          <w:rFonts w:hint="eastAsia"/>
+        </w:rPr>
+        <w:t>로 변경된다.</w:t>
+      </w:r>
+    </w:p>
+    <w:p>
+      <w:r>
+        <w:rPr>
+          <w:rFonts w:hint="eastAsia"/>
+        </w:rPr>
+        <w:t>만약 노드 연결 실패 시 점검 방법은 다음과 같다.</w:t>
+      </w:r>
+    </w:p>
+    <w:p>
+      <w:pPr>
+        <w:pStyle w:val="a3"/>
+        <w:numPr>
+          <w:ilvl w:val="0"/>
+          <w:numId w:val="18"/>
+        </w:numPr>
+        <w:ind w:leftChars="0"/>
+      </w:pPr>
+      <w:proofErr w:type="spellStart"/>
+      <w:r>
+        <w:rPr>
+          <w:rFonts w:hint="eastAsia"/>
+        </w:rPr>
+        <w:t>i</w:t>
+      </w:r>
+      <w:r>
+        <w:t>nit</w:t>
+      </w:r>
+      <w:proofErr w:type="spellEnd"/>
+      <w:r>
+        <w:rPr>
+          <w:rFonts w:hint="eastAsia"/>
+        </w:rPr>
+        <w:t xml:space="preserve">이나 </w:t>
+      </w:r>
+      <w:r>
+        <w:t>join</w:t>
+      </w:r>
+      <w:r>
+        <w:rPr>
+          <w:rFonts w:hint="eastAsia"/>
+        </w:rPr>
+        <w:t>을 잘못 수행한 경우</w:t>
+      </w:r>
+      <w:r>
+        <w:br/>
+      </w:r>
+      <w:proofErr w:type="spellStart"/>
+      <w:r>
+        <w:t>sudo</w:t>
+      </w:r>
+      <w:proofErr w:type="spellEnd"/>
+      <w:r>
+        <w:t xml:space="preserve"> </w:t>
+      </w:r>
+      <w:proofErr w:type="spellStart"/>
+      <w:r>
+        <w:t>kubeadm</w:t>
+      </w:r>
+      <w:proofErr w:type="spellEnd"/>
+      <w:r>
+        <w:t xml:space="preserve"> reset</w:t>
+      </w:r>
+      <w:r>
+        <w:rPr>
+          <w:rFonts w:hint="eastAsia"/>
+        </w:rPr>
+        <w:t>을 사용해 초기 설정으로 돌아갈 수 있다.</w:t>
+      </w:r>
+    </w:p>
+    <w:p>
+      <w:pPr>
+        <w:pStyle w:val="a3"/>
+        <w:numPr>
+          <w:ilvl w:val="0"/>
+          <w:numId w:val="18"/>
+        </w:numPr>
+        <w:ind w:leftChars="0"/>
+      </w:pPr>
+      <w:r>
+        <w:rPr>
+          <w:rFonts w:hint="eastAsia"/>
+        </w:rPr>
+        <w:t>t</w:t>
+      </w:r>
+      <w:r>
+        <w:t xml:space="preserve">oken </w:t>
+      </w:r>
+      <w:r>
+        <w:rPr>
+          <w:rFonts w:hint="eastAsia"/>
+        </w:rPr>
+        <w:t xml:space="preserve">재발급 받는 방법 </w:t>
+      </w:r>
+      <w:r>
+        <w:t>(</w:t>
+      </w:r>
+      <w:r>
+        <w:rPr>
+          <w:rFonts w:hint="eastAsia"/>
+        </w:rPr>
+        <w:t>마스터 노드에서 실습)</w:t>
+      </w:r>
+      <w:r>
+        <w:br/>
+        <w:t xml:space="preserve">- </w:t>
+      </w:r>
+      <w:r>
+        <w:rPr>
+          <w:rFonts w:hint="eastAsia"/>
+        </w:rPr>
+        <w:t>토근 리스트 확인하기:</w:t>
+      </w:r>
+      <w:r>
+        <w:t xml:space="preserve"> </w:t>
+      </w:r>
+      <w:proofErr w:type="spellStart"/>
+      <w:r>
+        <w:t>sudo</w:t>
+      </w:r>
+      <w:proofErr w:type="spellEnd"/>
+      <w:r>
+        <w:t xml:space="preserve"> </w:t>
+      </w:r>
+      <w:proofErr w:type="spellStart"/>
+      <w:r>
+        <w:t>kubeadm</w:t>
+      </w:r>
+      <w:proofErr w:type="spellEnd"/>
+      <w:r>
+        <w:t xml:space="preserve"> token list</w:t>
+      </w:r>
+      <w:r>
+        <w:br/>
+        <w:t xml:space="preserve">- </w:t>
+      </w:r>
+      <w:r>
+        <w:rPr>
+          <w:rFonts w:hint="eastAsia"/>
+        </w:rPr>
+        <w:t>토큰 재발급하기:</w:t>
+      </w:r>
+      <w:r>
+        <w:t xml:space="preserve"> </w:t>
+      </w:r>
+      <w:proofErr w:type="spellStart"/>
+      <w:r>
+        <w:t>sudo</w:t>
+      </w:r>
+      <w:proofErr w:type="spellEnd"/>
+      <w:r>
+        <w:t xml:space="preserve"> </w:t>
+      </w:r>
+      <w:proofErr w:type="spellStart"/>
+      <w:r>
+        <w:t>kubeadm</w:t>
+      </w:r>
+      <w:proofErr w:type="spellEnd"/>
+      <w:r>
+        <w:t xml:space="preserve"> token create --print-join-command</w:t>
+      </w:r>
+    </w:p>
+    <w:p>
+      <w:pPr>
+        <w:pStyle w:val="2"/>
+      </w:pPr>
+      <w:proofErr w:type="spellStart"/>
+      <w:r>
+        <w:rPr>
+          <w:rFonts w:hint="eastAsia"/>
+        </w:rPr>
+        <w:t>파드</w:t>
+      </w:r>
+      <w:proofErr w:type="spellEnd"/>
+      <w:r>
+        <w:rPr>
+          <w:rFonts w:hint="eastAsia"/>
+        </w:rPr>
+        <w:t xml:space="preserve"> 네트워크 배포</w:t>
+      </w:r>
+    </w:p>
+    <w:p>
+      <w:r>
+        <w:t>“</w:t>
+      </w:r>
+      <w:r>
+        <w:rPr>
+          <w:rFonts w:hint="eastAsia"/>
+        </w:rPr>
+        <w:t>마스터 노드</w:t>
+      </w:r>
+      <w:r>
+        <w:t>”</w:t>
+      </w:r>
+      <w:r>
+        <w:rPr>
+          <w:rFonts w:hint="eastAsia"/>
+        </w:rPr>
+        <w:t xml:space="preserve">에서 다음 명령을 실행하면 앞서 구성한 유저 설정을 통해 클러스터에 </w:t>
+      </w:r>
+      <w:r>
+        <w:t>cilium</w:t>
+      </w:r>
+      <w:r>
+        <w:rPr>
+          <w:rFonts w:hint="eastAsia"/>
+        </w:rPr>
+        <w:t>을 설치</w:t>
+      </w:r>
+    </w:p>
+    <w:p>
+      <w:hyperlink r:id="rId54" w:history="1">
+        <w:r>
+          <w:rPr>
+            <w:rStyle w:val="a4"/>
+          </w:rPr>
+          <w:t>https://kubernetes.io/docs/tasks/administer-cluster/network-policy-provider/cilium-network-policy/</w:t>
+        </w:r>
+      </w:hyperlink>
+      <w:r>
+        <w:t xml:space="preserve"> </w:t>
+      </w:r>
+      <w:r>
+        <w:rPr>
+          <w:rFonts w:hint="eastAsia"/>
+        </w:rPr>
+        <w:t>사이트 참조</w:t>
+      </w:r>
+    </w:p>
+    <w:p>
+      <w:r>
+        <w:t>curl -LO https://github.com/cilium/cilium-cli/releases/latest/download/cilium-linux amd64.tar.gz</w:t>
+      </w:r>
+    </w:p>
+    <w:p>
+      <w:proofErr w:type="spellStart"/>
+      <w:r>
+        <w:t>sudo</w:t>
+      </w:r>
+      <w:proofErr w:type="spellEnd"/>
+      <w:r>
+        <w:t xml:space="preserve"> tar </w:t>
+      </w:r>
+      <w:proofErr w:type="spellStart"/>
+      <w:r>
+        <w:t>xzvfC</w:t>
+      </w:r>
+      <w:proofErr w:type="spellEnd"/>
+      <w:r>
+        <w:t xml:space="preserve"> cilium-linux-amd64.tar.gz /</w:t>
+      </w:r>
+      <w:proofErr w:type="spellStart"/>
+      <w:r>
+        <w:t>usr</w:t>
+      </w:r>
+      <w:proofErr w:type="spellEnd"/>
+      <w:r>
+        <w:t>/local/bin</w:t>
+      </w:r>
+    </w:p>
+    <w:p>
+      <w:r>
+        <w:t>rm cilium-linux-amd64.tar.gz</w:t>
+      </w:r>
+    </w:p>
+    <w:p>
+      <w:r>
+        <w:t>cilium install</w:t>
+      </w:r>
+    </w:p>
+    <w:p>
+      <w:r>
+        <w:rPr>
+          <w:rFonts w:hint="eastAsia"/>
+        </w:rPr>
+        <w:t xml:space="preserve">이후 노드의 상태를 다시 확인을 해본다면 </w:t>
+      </w:r>
+      <w:r>
+        <w:t>STATUS</w:t>
+      </w:r>
+      <w:r>
+        <w:rPr>
+          <w:rFonts w:hint="eastAsia"/>
+        </w:rPr>
+        <w:t xml:space="preserve">가 </w:t>
+      </w:r>
+      <w:r>
+        <w:t>Ready</w:t>
+      </w:r>
+      <w:r>
+        <w:rPr>
+          <w:rFonts w:hint="eastAsia"/>
+        </w:rPr>
+        <w:t>가 된 것을 확인할 수 있다.</w:t>
+      </w:r>
+    </w:p>
+    <w:p>
+      <w:pPr>
+        <w:pStyle w:val="1"/>
+      </w:pPr>
+      <w:r>
+        <w:rPr>
+          <w:rFonts w:hint="eastAsia"/>
+        </w:rPr>
+        <w:t>G</w:t>
+      </w:r>
+      <w:r>
+        <w:t xml:space="preserve">CP </w:t>
+      </w:r>
+      <w:r>
+        <w:rPr>
+          <w:rFonts w:hint="eastAsia"/>
+        </w:rPr>
+        <w:t xml:space="preserve">환경에서 </w:t>
+      </w:r>
+      <w:r>
+        <w:t xml:space="preserve">VM </w:t>
+      </w:r>
+      <w:r>
+        <w:rPr>
+          <w:rFonts w:hint="eastAsia"/>
+        </w:rPr>
+        <w:t>준비하기</w:t>
       </w:r>
     </w:p>
     <w:p/>
@@ -5718,37 +8114,7 @@
         <w:rPr>
           <w:rFonts w:hint="eastAsia"/>
         </w:rPr>
-        <w:t>G</w:t>
-      </w:r>
-      <w:r>
-        <w:t xml:space="preserve">CP </w:t>
-      </w:r>
-      <w:r>
-        <w:rPr>
-          <w:rFonts w:hint="eastAsia"/>
-        </w:rPr>
-        <w:t xml:space="preserve">환경에서 </w:t>
-      </w:r>
-      <w:r>
-        <w:t xml:space="preserve">VM </w:t>
-      </w:r>
-      <w:r>
-        <w:rPr>
-          <w:rFonts w:hint="eastAsia"/>
-        </w:rPr>
-        <w:t>준비하기</w:t>
-      </w:r>
-    </w:p>
-    <w:p/>
-    <w:p/>
-    <w:p>
-      <w:pPr>
-        <w:pStyle w:val="1"/>
-      </w:pPr>
-      <w:r>
-        <w:rPr>
-          <w:rFonts w:hint="eastAsia"/>
-        </w:rPr>
+        <w:lastRenderedPageBreak/>
         <w:t>V</w:t>
       </w:r>
       <w:r>
@@ -6664,6 +9030,95 @@
     </w:lvl>
   </w:abstractNum>
   <w:abstractNum w:abstractNumId="8" w15:restartNumberingAfterBreak="0">
+    <w:nsid w:val="36A3430D"/>
+    <w:multiLevelType w:val="hybridMultilevel"/>
+    <w:tmpl w:val="1286200C"/>
+    <w:lvl w:ilvl="0" w:tplc="1A3855DA">
+      <w:start w:val="1"/>
+      <w:numFmt w:val="decimal"/>
+      <w:lvlText w:val="%1."/>
+      <w:lvlJc w:val="left"/>
+      <w:pPr>
+        <w:ind w:left="800" w:hanging="360"/>
+      </w:pPr>
+      <w:rPr>
+        <w:rFonts w:hint="default"/>
+      </w:rPr>
+    </w:lvl>
+    <w:lvl w:ilvl="1" w:tplc="04090019" w:tentative="1">
+      <w:start w:val="1"/>
+      <w:numFmt w:val="upperLetter"/>
+      <w:lvlText w:val="%2."/>
+      <w:lvlJc w:val="left"/>
+      <w:pPr>
+        <w:ind w:left="1320" w:hanging="440"/>
+      </w:pPr>
+    </w:lvl>
+    <w:lvl w:ilvl="2" w:tplc="0409001B" w:tentative="1">
+      <w:start w:val="1"/>
+      <w:numFmt w:val="lowerRoman"/>
+      <w:lvlText w:val="%3."/>
+      <w:lvlJc w:val="right"/>
+      <w:pPr>
+        <w:ind w:left="1760" w:hanging="440"/>
+      </w:pPr>
+    </w:lvl>
+    <w:lvl w:ilvl="3" w:tplc="0409000F" w:tentative="1">
+      <w:start w:val="1"/>
+      <w:numFmt w:val="decimal"/>
+      <w:lvlText w:val="%4."/>
+      <w:lvlJc w:val="left"/>
+      <w:pPr>
+        <w:ind w:left="2200" w:hanging="440"/>
+      </w:pPr>
+    </w:lvl>
+    <w:lvl w:ilvl="4" w:tplc="04090019" w:tentative="1">
+      <w:start w:val="1"/>
+      <w:numFmt w:val="upperLetter"/>
+      <w:lvlText w:val="%5."/>
+      <w:lvlJc w:val="left"/>
+      <w:pPr>
+        <w:ind w:left="2640" w:hanging="440"/>
+      </w:pPr>
+    </w:lvl>
+    <w:lvl w:ilvl="5" w:tplc="0409001B" w:tentative="1">
+      <w:start w:val="1"/>
+      <w:numFmt w:val="lowerRoman"/>
+      <w:lvlText w:val="%6."/>
+      <w:lvlJc w:val="right"/>
+      <w:pPr>
+        <w:ind w:left="3080" w:hanging="440"/>
+      </w:pPr>
+    </w:lvl>
+    <w:lvl w:ilvl="6" w:tplc="0409000F" w:tentative="1">
+      <w:start w:val="1"/>
+      <w:numFmt w:val="decimal"/>
+      <w:lvlText w:val="%7."/>
+      <w:lvlJc w:val="left"/>
+      <w:pPr>
+        <w:ind w:left="3520" w:hanging="440"/>
+      </w:pPr>
+    </w:lvl>
+    <w:lvl w:ilvl="7" w:tplc="04090019" w:tentative="1">
+      <w:start w:val="1"/>
+      <w:numFmt w:val="upperLetter"/>
+      <w:lvlText w:val="%8."/>
+      <w:lvlJc w:val="left"/>
+      <w:pPr>
+        <w:ind w:left="3960" w:hanging="440"/>
+      </w:pPr>
+    </w:lvl>
+    <w:lvl w:ilvl="8" w:tplc="0409001B" w:tentative="1">
+      <w:start w:val="1"/>
+      <w:numFmt w:val="lowerRoman"/>
+      <w:lvlText w:val="%9."/>
+      <w:lvlJc w:val="right"/>
+      <w:pPr>
+        <w:ind w:left="4400" w:hanging="440"/>
+      </w:pPr>
+    </w:lvl>
+  </w:abstractNum>
+  <w:abstractNum w:abstractNumId="9" w15:restartNumberingAfterBreak="0">
     <w:nsid w:val="40705409"/>
     <w:multiLevelType w:val="hybridMultilevel"/>
     <w:tmpl w:val="69DEC8BE"/>
@@ -6752,7 +9207,7 @@
       </w:pPr>
     </w:lvl>
   </w:abstractNum>
-  <w:abstractNum w:abstractNumId="9" w15:restartNumberingAfterBreak="0">
+  <w:abstractNum w:abstractNumId="10" w15:restartNumberingAfterBreak="0">
     <w:nsid w:val="4BCD3FE5"/>
     <w:multiLevelType w:val="hybridMultilevel"/>
     <w:tmpl w:val="BC3A9706"/>
@@ -6864,7 +9319,7 @@
       </w:rPr>
     </w:lvl>
   </w:abstractNum>
-  <w:abstractNum w:abstractNumId="10" w15:restartNumberingAfterBreak="0">
+  <w:abstractNum w:abstractNumId="11" w15:restartNumberingAfterBreak="0">
     <w:nsid w:val="62174A98"/>
     <w:multiLevelType w:val="hybridMultilevel"/>
     <w:tmpl w:val="D7A0D508"/>
@@ -6977,7 +9432,7 @@
       </w:rPr>
     </w:lvl>
   </w:abstractNum>
-  <w:abstractNum w:abstractNumId="11" w15:restartNumberingAfterBreak="0">
+  <w:abstractNum w:abstractNumId="12" w15:restartNumberingAfterBreak="0">
     <w:nsid w:val="62DB492A"/>
     <w:multiLevelType w:val="hybridMultilevel"/>
     <w:tmpl w:val="B4581EA4"/>
@@ -7089,7 +9544,7 @@
       </w:rPr>
     </w:lvl>
   </w:abstractNum>
-  <w:abstractNum w:abstractNumId="12" w15:restartNumberingAfterBreak="0">
+  <w:abstractNum w:abstractNumId="13" w15:restartNumberingAfterBreak="0">
     <w:nsid w:val="69A943F0"/>
     <w:multiLevelType w:val="hybridMultilevel"/>
     <w:tmpl w:val="1D0CDC5A"/>
@@ -7202,7 +9657,7 @@
       </w:rPr>
     </w:lvl>
   </w:abstractNum>
-  <w:abstractNum w:abstractNumId="13" w15:restartNumberingAfterBreak="0">
+  <w:abstractNum w:abstractNumId="14" w15:restartNumberingAfterBreak="0">
     <w:nsid w:val="6C4E3AC8"/>
     <w:multiLevelType w:val="hybridMultilevel"/>
     <w:tmpl w:val="1F7A0E02"/>
@@ -7291,7 +9746,7 @@
       </w:pPr>
     </w:lvl>
   </w:abstractNum>
-  <w:abstractNum w:abstractNumId="14" w15:restartNumberingAfterBreak="0">
+  <w:abstractNum w:abstractNumId="15" w15:restartNumberingAfterBreak="0">
     <w:nsid w:val="6C6648B1"/>
     <w:multiLevelType w:val="hybridMultilevel"/>
     <w:tmpl w:val="D8C0018A"/>
@@ -7380,7 +9835,7 @@
       </w:pPr>
     </w:lvl>
   </w:abstractNum>
-  <w:abstractNum w:abstractNumId="15" w15:restartNumberingAfterBreak="0">
+  <w:abstractNum w:abstractNumId="16" w15:restartNumberingAfterBreak="0">
     <w:nsid w:val="764511F5"/>
     <w:multiLevelType w:val="hybridMultilevel"/>
     <w:tmpl w:val="0D0E4B60"/>
@@ -7493,7 +9948,7 @@
       </w:rPr>
     </w:lvl>
   </w:abstractNum>
-  <w:abstractNum w:abstractNumId="16" w15:restartNumberingAfterBreak="0">
+  <w:abstractNum w:abstractNumId="17" w15:restartNumberingAfterBreak="0">
     <w:nsid w:val="7CD83118"/>
     <w:multiLevelType w:val="hybridMultilevel"/>
     <w:tmpl w:val="452AD748"/>
@@ -7609,40 +10064,40 @@
     <w:abstractNumId w:val="0"/>
   </w:num>
   <w:num w:numId="2" w16cid:durableId="2050064200">
-    <w:abstractNumId w:val="14"/>
+    <w:abstractNumId w:val="15"/>
   </w:num>
   <w:num w:numId="3" w16cid:durableId="334042425">
     <w:abstractNumId w:val="4"/>
   </w:num>
   <w:num w:numId="4" w16cid:durableId="1053312061">
-    <w:abstractNumId w:val="13"/>
+    <w:abstractNumId w:val="14"/>
   </w:num>
   <w:num w:numId="5" w16cid:durableId="1567763632">
-    <w:abstractNumId w:val="9"/>
+    <w:abstractNumId w:val="10"/>
   </w:num>
   <w:num w:numId="6" w16cid:durableId="761948301">
-    <w:abstractNumId w:val="16"/>
+    <w:abstractNumId w:val="17"/>
   </w:num>
   <w:num w:numId="7" w16cid:durableId="858274405">
     <w:abstractNumId w:val="1"/>
   </w:num>
   <w:num w:numId="8" w16cid:durableId="137890861">
-    <w:abstractNumId w:val="11"/>
+    <w:abstractNumId w:val="12"/>
   </w:num>
   <w:num w:numId="9" w16cid:durableId="441001776">
-    <w:abstractNumId w:val="8"/>
+    <w:abstractNumId w:val="9"/>
   </w:num>
   <w:num w:numId="10" w16cid:durableId="1334645595">
-    <w:abstractNumId w:val="10"/>
+    <w:abstractNumId w:val="11"/>
   </w:num>
   <w:num w:numId="11" w16cid:durableId="1406415926">
     <w:abstractNumId w:val="6"/>
   </w:num>
   <w:num w:numId="12" w16cid:durableId="65079625">
-    <w:abstractNumId w:val="15"/>
+    <w:abstractNumId w:val="16"/>
   </w:num>
   <w:num w:numId="13" w16cid:durableId="1975867874">
-    <w:abstractNumId w:val="12"/>
+    <w:abstractNumId w:val="13"/>
   </w:num>
   <w:num w:numId="14" w16cid:durableId="555968738">
     <w:abstractNumId w:val="5"/>
@@ -7655,6 +10110,9 @@
   </w:num>
   <w:num w:numId="17" w16cid:durableId="803935490">
     <w:abstractNumId w:val="2"/>
+  </w:num>
+  <w:num w:numId="18" w16cid:durableId="1992437786">
+    <w:abstractNumId w:val="8"/>
   </w:num>
 </w:numbering>
 </file>
@@ -8058,7 +10516,7 @@
   <w:style w:type="paragraph" w:default="1" w:styleId="a">
     <w:name w:val="Normal"/>
     <w:qFormat/>
-    <w:rsid w:val="009856C8"/>
+    <w:rsid w:val="005B0E84"/>
     <w:pPr>
       <w:widowControl w:val="0"/>
       <w:wordWrap w:val="0"/>

</xml_diff>